<commit_message>
Added workinstruction get all products of a particular machine
</commit_message>
<xml_diff>
--- a/Documentation/APIs Docs 2.0/Work Instruction.docx
+++ b/Documentation/APIs Docs 2.0/Work Instruction.docx
@@ -7861,6 +7861,2511 @@
       </w:r>
     </w:p>
     <w:p/>
+    <w:p/>
+    <w:p>
+      <w:pPr>
+        <w:spacing w:before="100" w:beforeAutospacing="1" w:after="100" w:afterAutospacing="1" w:line="240" w:lineRule="auto"/>
+        <w:rPr>
+          <w:rFonts w:ascii="Times New Roman" w:eastAsia="Times New Roman" w:hAnsi="Times New Roman" w:cs="Times New Roman"/>
+          <w:kern w:val="0"/>
+          <w:sz w:val="24"/>
+          <w:szCs w:val="24"/>
+          <w:lang w:eastAsia="en-IN"/>
+          <w14:ligatures w14:val="none"/>
+        </w:rPr>
+      </w:pPr>
+      <w:r>
+        <w:rPr>
+          <w:rFonts w:ascii="Times New Roman" w:eastAsia="Times New Roman" w:hAnsi="Times New Roman" w:cs="Times New Roman"/>
+          <w:kern w:val="0"/>
+          <w:sz w:val="24"/>
+          <w:szCs w:val="24"/>
+          <w:lang w:eastAsia="en-IN"/>
+          <w14:ligatures w14:val="none"/>
+        </w:rPr>
+        <w:t xml:space="preserve">Absolutely! Here's the complete API documentation to </w:t>
+      </w:r>
+      <w:r>
+        <w:rPr>
+          <w:rFonts w:ascii="Times New Roman" w:eastAsia="Times New Roman" w:hAnsi="Times New Roman" w:cs="Times New Roman"/>
+          <w:b/>
+          <w:bCs/>
+          <w:kern w:val="0"/>
+          <w:sz w:val="24"/>
+          <w:szCs w:val="24"/>
+          <w:lang w:eastAsia="en-IN"/>
+          <w14:ligatures w14:val="none"/>
+        </w:rPr>
+        <w:t>fetch all products for a particular machine code</w:t>
+      </w:r>
+      <w:r>
+        <w:rPr>
+          <w:rFonts w:ascii="Times New Roman" w:eastAsia="Times New Roman" w:hAnsi="Times New Roman" w:cs="Times New Roman"/>
+          <w:kern w:val="0"/>
+          <w:sz w:val="24"/>
+          <w:szCs w:val="24"/>
+          <w:lang w:eastAsia="en-IN"/>
+          <w14:ligatures w14:val="none"/>
+        </w:rPr>
+        <w:t xml:space="preserve">, with request/response examples and instructions for testing in </w:t>
+      </w:r>
+      <w:r>
+        <w:rPr>
+          <w:rFonts w:ascii="Times New Roman" w:eastAsia="Times New Roman" w:hAnsi="Times New Roman" w:cs="Times New Roman"/>
+          <w:b/>
+          <w:bCs/>
+          <w:kern w:val="0"/>
+          <w:sz w:val="24"/>
+          <w:szCs w:val="24"/>
+          <w:lang w:eastAsia="en-IN"/>
+          <w14:ligatures w14:val="none"/>
+        </w:rPr>
+        <w:t>Postman</w:t>
+      </w:r>
+      <w:r>
+        <w:rPr>
+          <w:rFonts w:ascii="Times New Roman" w:eastAsia="Times New Roman" w:hAnsi="Times New Roman" w:cs="Times New Roman"/>
+          <w:kern w:val="0"/>
+          <w:sz w:val="24"/>
+          <w:szCs w:val="24"/>
+          <w:lang w:eastAsia="en-IN"/>
+          <w14:ligatures w14:val="none"/>
+        </w:rPr>
+        <w:t xml:space="preserve"> — ready to share with your frontend dev </w:t>
+      </w:r>
+      <w:r>
+        <w:rPr>
+          <w:rFonts w:ascii="Segoe UI Emoji" w:eastAsia="Times New Roman" w:hAnsi="Segoe UI Emoji" w:cs="Segoe UI Emoji"/>
+          <w:kern w:val="0"/>
+          <w:sz w:val="24"/>
+          <w:szCs w:val="24"/>
+          <w:lang w:eastAsia="en-IN"/>
+          <w14:ligatures w14:val="none"/>
+        </w:rPr>
+        <w:t>✅</w:t>
+      </w:r>
+    </w:p>
+    <w:p>
+      <w:pPr>
+        <w:spacing w:after="0" w:line="240" w:lineRule="auto"/>
+        <w:rPr>
+          <w:rFonts w:ascii="Times New Roman" w:eastAsia="Times New Roman" w:hAnsi="Times New Roman" w:cs="Times New Roman"/>
+          <w:kern w:val="0"/>
+          <w:sz w:val="24"/>
+          <w:szCs w:val="24"/>
+          <w:lang w:eastAsia="en-IN"/>
+          <w14:ligatures w14:val="none"/>
+        </w:rPr>
+      </w:pPr>
+      <w:r>
+        <w:rPr>
+          <w:rFonts w:ascii="Times New Roman" w:eastAsia="Times New Roman" w:hAnsi="Times New Roman" w:cs="Times New Roman"/>
+          <w:kern w:val="0"/>
+          <w:sz w:val="24"/>
+          <w:szCs w:val="24"/>
+          <w:lang w:eastAsia="en-IN"/>
+          <w14:ligatures w14:val="none"/>
+        </w:rPr>
+        <w:pict w14:anchorId="1C0EFEC9">
+          <v:rect id="_x0000_i1038" style="width:0;height:1.5pt" o:hralign="center" o:hrstd="t" o:hr="t" fillcolor="#a0a0a0" stroked="f"/>
+        </w:pict>
+      </w:r>
+    </w:p>
+    <w:p>
+      <w:pPr>
+        <w:spacing w:before="100" w:beforeAutospacing="1" w:after="100" w:afterAutospacing="1" w:line="240" w:lineRule="auto"/>
+        <w:outlineLvl w:val="1"/>
+        <w:rPr>
+          <w:rFonts w:ascii="Times New Roman" w:eastAsia="Times New Roman" w:hAnsi="Times New Roman" w:cs="Times New Roman"/>
+          <w:b/>
+          <w:bCs/>
+          <w:kern w:val="0"/>
+          <w:sz w:val="36"/>
+          <w:szCs w:val="36"/>
+          <w:lang w:eastAsia="en-IN"/>
+          <w14:ligatures w14:val="none"/>
+        </w:rPr>
+      </w:pPr>
+      <w:r>
+        <w:rPr>
+          <w:rFonts w:ascii="Segoe UI Emoji" w:eastAsia="Times New Roman" w:hAnsi="Segoe UI Emoji" w:cs="Segoe UI Emoji"/>
+          <w:b/>
+          <w:bCs/>
+          <w:kern w:val="0"/>
+          <w:sz w:val="36"/>
+          <w:szCs w:val="36"/>
+          <w:lang w:eastAsia="en-IN"/>
+          <w14:ligatures w14:val="none"/>
+        </w:rPr>
+        <w:t>📘</w:t>
+      </w:r>
+      <w:r>
+        <w:rPr>
+          <w:rFonts w:ascii="Times New Roman" w:eastAsia="Times New Roman" w:hAnsi="Times New Roman" w:cs="Times New Roman"/>
+          <w:b/>
+          <w:bCs/>
+          <w:kern w:val="0"/>
+          <w:sz w:val="36"/>
+          <w:szCs w:val="36"/>
+          <w:lang w:eastAsia="en-IN"/>
+          <w14:ligatures w14:val="none"/>
+        </w:rPr>
+        <w:t xml:space="preserve"> Get Products by Machine Code – API Documentation</w:t>
+      </w:r>
+    </w:p>
+    <w:p>
+      <w:pPr>
+        <w:spacing w:before="100" w:beforeAutospacing="1" w:after="100" w:afterAutospacing="1" w:line="240" w:lineRule="auto"/>
+        <w:outlineLvl w:val="2"/>
+        <w:rPr>
+          <w:rFonts w:ascii="Times New Roman" w:eastAsia="Times New Roman" w:hAnsi="Times New Roman" w:cs="Times New Roman"/>
+          <w:b/>
+          <w:bCs/>
+          <w:kern w:val="0"/>
+          <w:sz w:val="27"/>
+          <w:szCs w:val="27"/>
+          <w:lang w:eastAsia="en-IN"/>
+          <w14:ligatures w14:val="none"/>
+        </w:rPr>
+      </w:pPr>
+      <w:r>
+        <w:rPr>
+          <w:rFonts w:ascii="Segoe UI Emoji" w:eastAsia="Times New Roman" w:hAnsi="Segoe UI Emoji" w:cs="Segoe UI Emoji"/>
+          <w:b/>
+          <w:bCs/>
+          <w:kern w:val="0"/>
+          <w:sz w:val="27"/>
+          <w:szCs w:val="27"/>
+          <w:lang w:eastAsia="en-IN"/>
+          <w14:ligatures w14:val="none"/>
+        </w:rPr>
+        <w:t>🧾</w:t>
+      </w:r>
+      <w:r>
+        <w:rPr>
+          <w:rFonts w:ascii="Times New Roman" w:eastAsia="Times New Roman" w:hAnsi="Times New Roman" w:cs="Times New Roman"/>
+          <w:b/>
+          <w:bCs/>
+          <w:kern w:val="0"/>
+          <w:sz w:val="27"/>
+          <w:szCs w:val="27"/>
+          <w:lang w:eastAsia="en-IN"/>
+          <w14:ligatures w14:val="none"/>
+        </w:rPr>
+        <w:t xml:space="preserve"> Endpoint</w:t>
+      </w:r>
+    </w:p>
+    <w:p>
+      <w:pPr>
+        <w:tabs>
+          <w:tab w:val="left" w:pos="916"/>
+          <w:tab w:val="left" w:pos="1832"/>
+          <w:tab w:val="left" w:pos="2748"/>
+          <w:tab w:val="left" w:pos="3664"/>
+          <w:tab w:val="left" w:pos="4580"/>
+          <w:tab w:val="left" w:pos="5496"/>
+          <w:tab w:val="left" w:pos="6412"/>
+          <w:tab w:val="left" w:pos="7328"/>
+          <w:tab w:val="left" w:pos="8244"/>
+          <w:tab w:val="left" w:pos="9160"/>
+          <w:tab w:val="left" w:pos="10076"/>
+          <w:tab w:val="left" w:pos="10992"/>
+          <w:tab w:val="left" w:pos="11908"/>
+          <w:tab w:val="left" w:pos="12824"/>
+          <w:tab w:val="left" w:pos="13740"/>
+          <w:tab w:val="left" w:pos="14656"/>
+        </w:tabs>
+        <w:spacing w:after="0" w:line="240" w:lineRule="auto"/>
+        <w:rPr>
+          <w:rFonts w:ascii="Courier New" w:eastAsia="Times New Roman" w:hAnsi="Courier New" w:cs="Courier New"/>
+          <w:kern w:val="0"/>
+          <w:sz w:val="20"/>
+          <w:szCs w:val="20"/>
+          <w:lang w:eastAsia="en-IN"/>
+          <w14:ligatures w14:val="none"/>
+        </w:rPr>
+      </w:pPr>
+      <w:r>
+        <w:rPr>
+          <w:rFonts w:ascii="Courier New" w:eastAsia="Times New Roman" w:hAnsi="Courier New" w:cs="Courier New"/>
+          <w:kern w:val="0"/>
+          <w:sz w:val="20"/>
+          <w:szCs w:val="20"/>
+          <w:lang w:eastAsia="en-IN"/>
+          <w14:ligatures w14:val="none"/>
+        </w:rPr>
+        <w:t>GET /</w:t>
+      </w:r>
+      <w:proofErr w:type="spellStart"/>
+      <w:r>
+        <w:rPr>
+          <w:rFonts w:ascii="Courier New" w:eastAsia="Times New Roman" w:hAnsi="Courier New" w:cs="Courier New"/>
+          <w:kern w:val="0"/>
+          <w:sz w:val="20"/>
+          <w:szCs w:val="20"/>
+          <w:lang w:eastAsia="en-IN"/>
+          <w14:ligatures w14:val="none"/>
+        </w:rPr>
+        <w:t>api</w:t>
+      </w:r>
+      <w:proofErr w:type="spellEnd"/>
+      <w:r>
+        <w:rPr>
+          <w:rFonts w:ascii="Courier New" w:eastAsia="Times New Roman" w:hAnsi="Courier New" w:cs="Courier New"/>
+          <w:kern w:val="0"/>
+          <w:sz w:val="20"/>
+          <w:szCs w:val="20"/>
+          <w:lang w:eastAsia="en-IN"/>
+          <w14:ligatures w14:val="none"/>
+        </w:rPr>
+        <w:t>/products/machine</w:t>
+      </w:r>
+      <w:proofErr w:type="gramStart"/>
+      <w:r>
+        <w:rPr>
+          <w:rFonts w:ascii="Courier New" w:eastAsia="Times New Roman" w:hAnsi="Courier New" w:cs="Courier New"/>
+          <w:kern w:val="0"/>
+          <w:sz w:val="20"/>
+          <w:szCs w:val="20"/>
+          <w:lang w:eastAsia="en-IN"/>
+          <w14:ligatures w14:val="none"/>
+        </w:rPr>
+        <w:t>/:</w:t>
+      </w:r>
+      <w:proofErr w:type="spellStart"/>
+      <w:r>
+        <w:rPr>
+          <w:rFonts w:ascii="Courier New" w:eastAsia="Times New Roman" w:hAnsi="Courier New" w:cs="Courier New"/>
+          <w:kern w:val="0"/>
+          <w:sz w:val="20"/>
+          <w:szCs w:val="20"/>
+          <w:lang w:eastAsia="en-IN"/>
+          <w14:ligatures w14:val="none"/>
+        </w:rPr>
+        <w:t>machineCode</w:t>
+      </w:r>
+      <w:proofErr w:type="spellEnd"/>
+      <w:proofErr w:type="gramEnd"/>
+    </w:p>
+    <w:p>
+      <w:pPr>
+        <w:spacing w:before="100" w:beforeAutospacing="1" w:after="100" w:afterAutospacing="1" w:line="240" w:lineRule="auto"/>
+        <w:outlineLvl w:val="2"/>
+        <w:rPr>
+          <w:rFonts w:ascii="Times New Roman" w:eastAsia="Times New Roman" w:hAnsi="Times New Roman" w:cs="Times New Roman"/>
+          <w:b/>
+          <w:bCs/>
+          <w:kern w:val="0"/>
+          <w:sz w:val="27"/>
+          <w:szCs w:val="27"/>
+          <w:lang w:eastAsia="en-IN"/>
+          <w14:ligatures w14:val="none"/>
+        </w:rPr>
+      </w:pPr>
+      <w:r>
+        <w:rPr>
+          <w:rFonts w:ascii="Segoe UI Emoji" w:eastAsia="Times New Roman" w:hAnsi="Segoe UI Emoji" w:cs="Segoe UI Emoji"/>
+          <w:b/>
+          <w:bCs/>
+          <w:kern w:val="0"/>
+          <w:sz w:val="27"/>
+          <w:szCs w:val="27"/>
+          <w:lang w:eastAsia="en-IN"/>
+          <w14:ligatures w14:val="none"/>
+        </w:rPr>
+        <w:t>📌</w:t>
+      </w:r>
+      <w:r>
+        <w:rPr>
+          <w:rFonts w:ascii="Times New Roman" w:eastAsia="Times New Roman" w:hAnsi="Times New Roman" w:cs="Times New Roman"/>
+          <w:b/>
+          <w:bCs/>
+          <w:kern w:val="0"/>
+          <w:sz w:val="27"/>
+          <w:szCs w:val="27"/>
+          <w:lang w:eastAsia="en-IN"/>
+          <w14:ligatures w14:val="none"/>
+        </w:rPr>
+        <w:t xml:space="preserve"> Purpose</w:t>
+      </w:r>
+    </w:p>
+    <w:p>
+      <w:pPr>
+        <w:spacing w:before="100" w:beforeAutospacing="1" w:after="100" w:afterAutospacing="1" w:line="240" w:lineRule="auto"/>
+        <w:rPr>
+          <w:rFonts w:ascii="Times New Roman" w:eastAsia="Times New Roman" w:hAnsi="Times New Roman" w:cs="Times New Roman"/>
+          <w:kern w:val="0"/>
+          <w:sz w:val="24"/>
+          <w:szCs w:val="24"/>
+          <w:lang w:eastAsia="en-IN"/>
+          <w14:ligatures w14:val="none"/>
+        </w:rPr>
+      </w:pPr>
+      <w:r>
+        <w:rPr>
+          <w:rFonts w:ascii="Times New Roman" w:eastAsia="Times New Roman" w:hAnsi="Times New Roman" w:cs="Times New Roman"/>
+          <w:kern w:val="0"/>
+          <w:sz w:val="24"/>
+          <w:szCs w:val="24"/>
+          <w:lang w:eastAsia="en-IN"/>
+          <w14:ligatures w14:val="none"/>
+        </w:rPr>
+        <w:t xml:space="preserve">Retrieve all </w:t>
+      </w:r>
+      <w:r>
+        <w:rPr>
+          <w:rFonts w:ascii="Times New Roman" w:eastAsia="Times New Roman" w:hAnsi="Times New Roman" w:cs="Times New Roman"/>
+          <w:b/>
+          <w:bCs/>
+          <w:kern w:val="0"/>
+          <w:sz w:val="24"/>
+          <w:szCs w:val="24"/>
+          <w:lang w:eastAsia="en-IN"/>
+          <w14:ligatures w14:val="none"/>
+        </w:rPr>
+        <w:t>distinct products</w:t>
+      </w:r>
+      <w:r>
+        <w:rPr>
+          <w:rFonts w:ascii="Times New Roman" w:eastAsia="Times New Roman" w:hAnsi="Times New Roman" w:cs="Times New Roman"/>
+          <w:kern w:val="0"/>
+          <w:sz w:val="24"/>
+          <w:szCs w:val="24"/>
+          <w:lang w:eastAsia="en-IN"/>
+          <w14:ligatures w14:val="none"/>
+        </w:rPr>
+        <w:t xml:space="preserve"> that have Work Instructions configured for a specific machine.</w:t>
+      </w:r>
+    </w:p>
+    <w:p>
+      <w:pPr>
+        <w:spacing w:after="0" w:line="240" w:lineRule="auto"/>
+        <w:rPr>
+          <w:rFonts w:ascii="Times New Roman" w:eastAsia="Times New Roman" w:hAnsi="Times New Roman" w:cs="Times New Roman"/>
+          <w:kern w:val="0"/>
+          <w:sz w:val="24"/>
+          <w:szCs w:val="24"/>
+          <w:lang w:eastAsia="en-IN"/>
+          <w14:ligatures w14:val="none"/>
+        </w:rPr>
+      </w:pPr>
+      <w:r>
+        <w:rPr>
+          <w:rFonts w:ascii="Times New Roman" w:eastAsia="Times New Roman" w:hAnsi="Times New Roman" w:cs="Times New Roman"/>
+          <w:kern w:val="0"/>
+          <w:sz w:val="24"/>
+          <w:szCs w:val="24"/>
+          <w:lang w:eastAsia="en-IN"/>
+          <w14:ligatures w14:val="none"/>
+        </w:rPr>
+        <w:pict w14:anchorId="065124CA">
+          <v:rect id="_x0000_i1039" style="width:0;height:1.5pt" o:hralign="center" o:hrstd="t" o:hr="t" fillcolor="#a0a0a0" stroked="f"/>
+        </w:pict>
+      </w:r>
+    </w:p>
+    <w:p>
+      <w:pPr>
+        <w:spacing w:before="100" w:beforeAutospacing="1" w:after="100" w:afterAutospacing="1" w:line="240" w:lineRule="auto"/>
+        <w:outlineLvl w:val="2"/>
+        <w:rPr>
+          <w:rFonts w:ascii="Times New Roman" w:eastAsia="Times New Roman" w:hAnsi="Times New Roman" w:cs="Times New Roman"/>
+          <w:b/>
+          <w:bCs/>
+          <w:kern w:val="0"/>
+          <w:sz w:val="27"/>
+          <w:szCs w:val="27"/>
+          <w:lang w:eastAsia="en-IN"/>
+          <w14:ligatures w14:val="none"/>
+        </w:rPr>
+      </w:pPr>
+      <w:r>
+        <w:rPr>
+          <w:rFonts w:ascii="Segoe UI Emoji" w:eastAsia="Times New Roman" w:hAnsi="Segoe UI Emoji" w:cs="Segoe UI Emoji"/>
+          <w:b/>
+          <w:bCs/>
+          <w:kern w:val="0"/>
+          <w:sz w:val="27"/>
+          <w:szCs w:val="27"/>
+          <w:lang w:eastAsia="en-IN"/>
+          <w14:ligatures w14:val="none"/>
+        </w:rPr>
+        <w:t>🔐</w:t>
+      </w:r>
+      <w:r>
+        <w:rPr>
+          <w:rFonts w:ascii="Times New Roman" w:eastAsia="Times New Roman" w:hAnsi="Times New Roman" w:cs="Times New Roman"/>
+          <w:b/>
+          <w:bCs/>
+          <w:kern w:val="0"/>
+          <w:sz w:val="27"/>
+          <w:szCs w:val="27"/>
+          <w:lang w:eastAsia="en-IN"/>
+          <w14:ligatures w14:val="none"/>
+        </w:rPr>
+        <w:t xml:space="preserve"> Headers</w:t>
+      </w:r>
+    </w:p>
+    <w:p>
+      <w:pPr>
+        <w:spacing w:before="100" w:beforeAutospacing="1" w:after="100" w:afterAutospacing="1" w:line="240" w:lineRule="auto"/>
+        <w:rPr>
+          <w:rFonts w:ascii="Times New Roman" w:eastAsia="Times New Roman" w:hAnsi="Times New Roman" w:cs="Times New Roman"/>
+          <w:kern w:val="0"/>
+          <w:sz w:val="24"/>
+          <w:szCs w:val="24"/>
+          <w:lang w:eastAsia="en-IN"/>
+          <w14:ligatures w14:val="none"/>
+        </w:rPr>
+      </w:pPr>
+      <w:r>
+        <w:rPr>
+          <w:rFonts w:ascii="Times New Roman" w:eastAsia="Times New Roman" w:hAnsi="Times New Roman" w:cs="Times New Roman"/>
+          <w:kern w:val="0"/>
+          <w:sz w:val="24"/>
+          <w:szCs w:val="24"/>
+          <w:lang w:eastAsia="en-IN"/>
+          <w14:ligatures w14:val="none"/>
+        </w:rPr>
+        <w:t>None required</w:t>
+      </w:r>
+    </w:p>
+    <w:p>
+      <w:pPr>
+        <w:spacing w:after="0" w:line="240" w:lineRule="auto"/>
+        <w:rPr>
+          <w:rFonts w:ascii="Times New Roman" w:eastAsia="Times New Roman" w:hAnsi="Times New Roman" w:cs="Times New Roman"/>
+          <w:kern w:val="0"/>
+          <w:sz w:val="24"/>
+          <w:szCs w:val="24"/>
+          <w:lang w:eastAsia="en-IN"/>
+          <w14:ligatures w14:val="none"/>
+        </w:rPr>
+      </w:pPr>
+      <w:r>
+        <w:rPr>
+          <w:rFonts w:ascii="Times New Roman" w:eastAsia="Times New Roman" w:hAnsi="Times New Roman" w:cs="Times New Roman"/>
+          <w:kern w:val="0"/>
+          <w:sz w:val="24"/>
+          <w:szCs w:val="24"/>
+          <w:lang w:eastAsia="en-IN"/>
+          <w14:ligatures w14:val="none"/>
+        </w:rPr>
+        <w:pict w14:anchorId="71FCFC99">
+          <v:rect id="_x0000_i1040" style="width:0;height:1.5pt" o:hralign="center" o:hrstd="t" o:hr="t" fillcolor="#a0a0a0" stroked="f"/>
+        </w:pict>
+      </w:r>
+    </w:p>
+    <w:p>
+      <w:pPr>
+        <w:spacing w:before="100" w:beforeAutospacing="1" w:after="100" w:afterAutospacing="1" w:line="240" w:lineRule="auto"/>
+        <w:outlineLvl w:val="2"/>
+        <w:rPr>
+          <w:rFonts w:ascii="Times New Roman" w:eastAsia="Times New Roman" w:hAnsi="Times New Roman" w:cs="Times New Roman"/>
+          <w:b/>
+          <w:bCs/>
+          <w:kern w:val="0"/>
+          <w:sz w:val="27"/>
+          <w:szCs w:val="27"/>
+          <w:lang w:eastAsia="en-IN"/>
+          <w14:ligatures w14:val="none"/>
+        </w:rPr>
+      </w:pPr>
+      <w:r>
+        <w:rPr>
+          <w:rFonts w:ascii="Segoe UI Emoji" w:eastAsia="Times New Roman" w:hAnsi="Segoe UI Emoji" w:cs="Segoe UI Emoji"/>
+          <w:b/>
+          <w:bCs/>
+          <w:kern w:val="0"/>
+          <w:sz w:val="27"/>
+          <w:szCs w:val="27"/>
+          <w:lang w:eastAsia="en-IN"/>
+          <w14:ligatures w14:val="none"/>
+        </w:rPr>
+        <w:t>📥</w:t>
+      </w:r>
+      <w:r>
+        <w:rPr>
+          <w:rFonts w:ascii="Times New Roman" w:eastAsia="Times New Roman" w:hAnsi="Times New Roman" w:cs="Times New Roman"/>
+          <w:b/>
+          <w:bCs/>
+          <w:kern w:val="0"/>
+          <w:sz w:val="27"/>
+          <w:szCs w:val="27"/>
+          <w:lang w:eastAsia="en-IN"/>
+          <w14:ligatures w14:val="none"/>
+        </w:rPr>
+        <w:t xml:space="preserve"> URL Parameters</w:t>
+      </w:r>
+    </w:p>
+    <w:tbl>
+      <w:tblPr>
+        <w:tblW w:w="0" w:type="auto"/>
+        <w:tblCellSpacing w:w="15" w:type="dxa"/>
+        <w:tblCellMar>
+          <w:top w:w="15" w:type="dxa"/>
+          <w:left w:w="15" w:type="dxa"/>
+          <w:bottom w:w="15" w:type="dxa"/>
+          <w:right w:w="15" w:type="dxa"/>
+        </w:tblCellMar>
+        <w:tblLook w:val="04A0" w:firstRow="1" w:lastRow="0" w:firstColumn="1" w:lastColumn="0" w:noHBand="0" w:noVBand="1"/>
+      </w:tblPr>
+      <w:tblGrid>
+        <w:gridCol w:w="1396"/>
+        <w:gridCol w:w="647"/>
+        <w:gridCol w:w="1020"/>
+        <w:gridCol w:w="3794"/>
+      </w:tblGrid>
+      <w:tr>
+        <w:trPr>
+          <w:tblHeader/>
+          <w:tblCellSpacing w:w="15" w:type="dxa"/>
+        </w:trPr>
+        <w:tc>
+          <w:tcPr>
+            <w:tcW w:w="0" w:type="auto"/>
+            <w:vAlign w:val="center"/>
+            <w:hideMark/>
+          </w:tcPr>
+          <w:p>
+            <w:pPr>
+              <w:spacing w:after="0" w:line="240" w:lineRule="auto"/>
+              <w:jc w:val="center"/>
+              <w:rPr>
+                <w:rFonts w:ascii="Times New Roman" w:eastAsia="Times New Roman" w:hAnsi="Times New Roman" w:cs="Times New Roman"/>
+                <w:b/>
+                <w:bCs/>
+                <w:kern w:val="0"/>
+                <w:sz w:val="24"/>
+                <w:szCs w:val="24"/>
+                <w:lang w:eastAsia="en-IN"/>
+                <w14:ligatures w14:val="none"/>
+              </w:rPr>
+            </w:pPr>
+            <w:r>
+              <w:rPr>
+                <w:rFonts w:ascii="Times New Roman" w:eastAsia="Times New Roman" w:hAnsi="Times New Roman" w:cs="Times New Roman"/>
+                <w:b/>
+                <w:bCs/>
+                <w:kern w:val="0"/>
+                <w:sz w:val="24"/>
+                <w:szCs w:val="24"/>
+                <w:lang w:eastAsia="en-IN"/>
+                <w14:ligatures w14:val="none"/>
+              </w:rPr>
+              <w:t>Parameter</w:t>
+            </w:r>
+          </w:p>
+        </w:tc>
+        <w:tc>
+          <w:tcPr>
+            <w:tcW w:w="0" w:type="auto"/>
+            <w:vAlign w:val="center"/>
+            <w:hideMark/>
+          </w:tcPr>
+          <w:p>
+            <w:pPr>
+              <w:spacing w:after="0" w:line="240" w:lineRule="auto"/>
+              <w:jc w:val="center"/>
+              <w:rPr>
+                <w:rFonts w:ascii="Times New Roman" w:eastAsia="Times New Roman" w:hAnsi="Times New Roman" w:cs="Times New Roman"/>
+                <w:b/>
+                <w:bCs/>
+                <w:kern w:val="0"/>
+                <w:sz w:val="24"/>
+                <w:szCs w:val="24"/>
+                <w:lang w:eastAsia="en-IN"/>
+                <w14:ligatures w14:val="none"/>
+              </w:rPr>
+            </w:pPr>
+            <w:r>
+              <w:rPr>
+                <w:rFonts w:ascii="Times New Roman" w:eastAsia="Times New Roman" w:hAnsi="Times New Roman" w:cs="Times New Roman"/>
+                <w:b/>
+                <w:bCs/>
+                <w:kern w:val="0"/>
+                <w:sz w:val="24"/>
+                <w:szCs w:val="24"/>
+                <w:lang w:eastAsia="en-IN"/>
+                <w14:ligatures w14:val="none"/>
+              </w:rPr>
+              <w:t>Type</w:t>
+            </w:r>
+          </w:p>
+        </w:tc>
+        <w:tc>
+          <w:tcPr>
+            <w:tcW w:w="0" w:type="auto"/>
+            <w:vAlign w:val="center"/>
+            <w:hideMark/>
+          </w:tcPr>
+          <w:p>
+            <w:pPr>
+              <w:spacing w:after="0" w:line="240" w:lineRule="auto"/>
+              <w:jc w:val="center"/>
+              <w:rPr>
+                <w:rFonts w:ascii="Times New Roman" w:eastAsia="Times New Roman" w:hAnsi="Times New Roman" w:cs="Times New Roman"/>
+                <w:b/>
+                <w:bCs/>
+                <w:kern w:val="0"/>
+                <w:sz w:val="24"/>
+                <w:szCs w:val="24"/>
+                <w:lang w:eastAsia="en-IN"/>
+                <w14:ligatures w14:val="none"/>
+              </w:rPr>
+            </w:pPr>
+            <w:r>
+              <w:rPr>
+                <w:rFonts w:ascii="Times New Roman" w:eastAsia="Times New Roman" w:hAnsi="Times New Roman" w:cs="Times New Roman"/>
+                <w:b/>
+                <w:bCs/>
+                <w:kern w:val="0"/>
+                <w:sz w:val="24"/>
+                <w:szCs w:val="24"/>
+                <w:lang w:eastAsia="en-IN"/>
+                <w14:ligatures w14:val="none"/>
+              </w:rPr>
+              <w:t>Required</w:t>
+            </w:r>
+          </w:p>
+        </w:tc>
+        <w:tc>
+          <w:tcPr>
+            <w:tcW w:w="0" w:type="auto"/>
+            <w:vAlign w:val="center"/>
+            <w:hideMark/>
+          </w:tcPr>
+          <w:p>
+            <w:pPr>
+              <w:spacing w:after="0" w:line="240" w:lineRule="auto"/>
+              <w:jc w:val="center"/>
+              <w:rPr>
+                <w:rFonts w:ascii="Times New Roman" w:eastAsia="Times New Roman" w:hAnsi="Times New Roman" w:cs="Times New Roman"/>
+                <w:b/>
+                <w:bCs/>
+                <w:kern w:val="0"/>
+                <w:sz w:val="24"/>
+                <w:szCs w:val="24"/>
+                <w:lang w:eastAsia="en-IN"/>
+                <w14:ligatures w14:val="none"/>
+              </w:rPr>
+            </w:pPr>
+            <w:r>
+              <w:rPr>
+                <w:rFonts w:ascii="Times New Roman" w:eastAsia="Times New Roman" w:hAnsi="Times New Roman" w:cs="Times New Roman"/>
+                <w:b/>
+                <w:bCs/>
+                <w:kern w:val="0"/>
+                <w:sz w:val="24"/>
+                <w:szCs w:val="24"/>
+                <w:lang w:eastAsia="en-IN"/>
+                <w14:ligatures w14:val="none"/>
+              </w:rPr>
+              <w:t>Description</w:t>
+            </w:r>
+          </w:p>
+        </w:tc>
+      </w:tr>
+      <w:tr>
+        <w:trPr>
+          <w:tblCellSpacing w:w="15" w:type="dxa"/>
+        </w:trPr>
+        <w:tc>
+          <w:tcPr>
+            <w:tcW w:w="0" w:type="auto"/>
+            <w:vAlign w:val="center"/>
+            <w:hideMark/>
+          </w:tcPr>
+          <w:p>
+            <w:pPr>
+              <w:spacing w:after="0" w:line="240" w:lineRule="auto"/>
+              <w:rPr>
+                <w:rFonts w:ascii="Times New Roman" w:eastAsia="Times New Roman" w:hAnsi="Times New Roman" w:cs="Times New Roman"/>
+                <w:kern w:val="0"/>
+                <w:sz w:val="24"/>
+                <w:szCs w:val="24"/>
+                <w:lang w:eastAsia="en-IN"/>
+                <w14:ligatures w14:val="none"/>
+              </w:rPr>
+            </w:pPr>
+            <w:proofErr w:type="spellStart"/>
+            <w:r>
+              <w:rPr>
+                <w:rFonts w:ascii="Courier New" w:eastAsia="Times New Roman" w:hAnsi="Courier New" w:cs="Courier New"/>
+                <w:kern w:val="0"/>
+                <w:sz w:val="20"/>
+                <w:szCs w:val="20"/>
+                <w:lang w:eastAsia="en-IN"/>
+                <w14:ligatures w14:val="none"/>
+              </w:rPr>
+              <w:t>machineCode</w:t>
+            </w:r>
+            <w:proofErr w:type="spellEnd"/>
+          </w:p>
+        </w:tc>
+        <w:tc>
+          <w:tcPr>
+            <w:tcW w:w="0" w:type="auto"/>
+            <w:vAlign w:val="center"/>
+            <w:hideMark/>
+          </w:tcPr>
+          <w:p>
+            <w:pPr>
+              <w:spacing w:after="0" w:line="240" w:lineRule="auto"/>
+              <w:rPr>
+                <w:rFonts w:ascii="Times New Roman" w:eastAsia="Times New Roman" w:hAnsi="Times New Roman" w:cs="Times New Roman"/>
+                <w:kern w:val="0"/>
+                <w:sz w:val="24"/>
+                <w:szCs w:val="24"/>
+                <w:lang w:eastAsia="en-IN"/>
+                <w14:ligatures w14:val="none"/>
+              </w:rPr>
+            </w:pPr>
+            <w:r>
+              <w:rPr>
+                <w:rFonts w:ascii="Times New Roman" w:eastAsia="Times New Roman" w:hAnsi="Times New Roman" w:cs="Times New Roman"/>
+                <w:kern w:val="0"/>
+                <w:sz w:val="24"/>
+                <w:szCs w:val="24"/>
+                <w:lang w:eastAsia="en-IN"/>
+                <w14:ligatures w14:val="none"/>
+              </w:rPr>
+              <w:t>String</w:t>
+            </w:r>
+          </w:p>
+        </w:tc>
+        <w:tc>
+          <w:tcPr>
+            <w:tcW w:w="0" w:type="auto"/>
+            <w:vAlign w:val="center"/>
+            <w:hideMark/>
+          </w:tcPr>
+          <w:p>
+            <w:pPr>
+              <w:spacing w:after="0" w:line="240" w:lineRule="auto"/>
+              <w:rPr>
+                <w:rFonts w:ascii="Times New Roman" w:eastAsia="Times New Roman" w:hAnsi="Times New Roman" w:cs="Times New Roman"/>
+                <w:kern w:val="0"/>
+                <w:sz w:val="24"/>
+                <w:szCs w:val="24"/>
+                <w:lang w:eastAsia="en-IN"/>
+                <w14:ligatures w14:val="none"/>
+              </w:rPr>
+            </w:pPr>
+            <w:r>
+              <w:rPr>
+                <w:rFonts w:ascii="Segoe UI Emoji" w:eastAsia="Times New Roman" w:hAnsi="Segoe UI Emoji" w:cs="Segoe UI Emoji"/>
+                <w:kern w:val="0"/>
+                <w:sz w:val="24"/>
+                <w:szCs w:val="24"/>
+                <w:lang w:eastAsia="en-IN"/>
+                <w14:ligatures w14:val="none"/>
+              </w:rPr>
+              <w:t>✅</w:t>
+            </w:r>
+            <w:r>
+              <w:rPr>
+                <w:rFonts w:ascii="Times New Roman" w:eastAsia="Times New Roman" w:hAnsi="Times New Roman" w:cs="Times New Roman"/>
+                <w:kern w:val="0"/>
+                <w:sz w:val="24"/>
+                <w:szCs w:val="24"/>
+                <w:lang w:eastAsia="en-IN"/>
+                <w14:ligatures w14:val="none"/>
+              </w:rPr>
+              <w:t xml:space="preserve"> Yes</w:t>
+            </w:r>
+          </w:p>
+        </w:tc>
+        <w:tc>
+          <w:tcPr>
+            <w:tcW w:w="0" w:type="auto"/>
+            <w:vAlign w:val="center"/>
+            <w:hideMark/>
+          </w:tcPr>
+          <w:p>
+            <w:pPr>
+              <w:spacing w:after="0" w:line="240" w:lineRule="auto"/>
+              <w:rPr>
+                <w:rFonts w:ascii="Times New Roman" w:eastAsia="Times New Roman" w:hAnsi="Times New Roman" w:cs="Times New Roman"/>
+                <w:kern w:val="0"/>
+                <w:sz w:val="24"/>
+                <w:szCs w:val="24"/>
+                <w:lang w:eastAsia="en-IN"/>
+                <w14:ligatures w14:val="none"/>
+              </w:rPr>
+            </w:pPr>
+            <w:r>
+              <w:rPr>
+                <w:rFonts w:ascii="Times New Roman" w:eastAsia="Times New Roman" w:hAnsi="Times New Roman" w:cs="Times New Roman"/>
+                <w:kern w:val="0"/>
+                <w:sz w:val="24"/>
+                <w:szCs w:val="24"/>
+                <w:lang w:eastAsia="en-IN"/>
+                <w14:ligatures w14:val="none"/>
+              </w:rPr>
+              <w:t>The machine code to filter products by</w:t>
+            </w:r>
+          </w:p>
+        </w:tc>
+      </w:tr>
+    </w:tbl>
+    <w:p>
+      <w:pPr>
+        <w:spacing w:after="0" w:line="240" w:lineRule="auto"/>
+        <w:rPr>
+          <w:rFonts w:ascii="Times New Roman" w:eastAsia="Times New Roman" w:hAnsi="Times New Roman" w:cs="Times New Roman"/>
+          <w:kern w:val="0"/>
+          <w:sz w:val="24"/>
+          <w:szCs w:val="24"/>
+          <w:lang w:eastAsia="en-IN"/>
+          <w14:ligatures w14:val="none"/>
+        </w:rPr>
+      </w:pPr>
+      <w:r>
+        <w:rPr>
+          <w:rFonts w:ascii="Times New Roman" w:eastAsia="Times New Roman" w:hAnsi="Times New Roman" w:cs="Times New Roman"/>
+          <w:kern w:val="0"/>
+          <w:sz w:val="24"/>
+          <w:szCs w:val="24"/>
+          <w:lang w:eastAsia="en-IN"/>
+          <w14:ligatures w14:val="none"/>
+        </w:rPr>
+        <w:pict w14:anchorId="117361A9">
+          <v:rect id="_x0000_i1041" style="width:0;height:1.5pt" o:hralign="center" o:hrstd="t" o:hr="t" fillcolor="#a0a0a0" stroked="f"/>
+        </w:pict>
+      </w:r>
+    </w:p>
+    <w:p>
+      <w:pPr>
+        <w:spacing w:before="100" w:beforeAutospacing="1" w:after="100" w:afterAutospacing="1" w:line="240" w:lineRule="auto"/>
+        <w:outlineLvl w:val="2"/>
+        <w:rPr>
+          <w:rFonts w:ascii="Times New Roman" w:eastAsia="Times New Roman" w:hAnsi="Times New Roman" w:cs="Times New Roman"/>
+          <w:b/>
+          <w:bCs/>
+          <w:kern w:val="0"/>
+          <w:sz w:val="27"/>
+          <w:szCs w:val="27"/>
+          <w:lang w:eastAsia="en-IN"/>
+          <w14:ligatures w14:val="none"/>
+        </w:rPr>
+      </w:pPr>
+      <w:r>
+        <w:rPr>
+          <w:rFonts w:ascii="Segoe UI Emoji" w:eastAsia="Times New Roman" w:hAnsi="Segoe UI Emoji" w:cs="Segoe UI Emoji"/>
+          <w:b/>
+          <w:bCs/>
+          <w:kern w:val="0"/>
+          <w:sz w:val="27"/>
+          <w:szCs w:val="27"/>
+          <w:lang w:eastAsia="en-IN"/>
+          <w14:ligatures w14:val="none"/>
+        </w:rPr>
+        <w:t>📤</w:t>
+      </w:r>
+      <w:r>
+        <w:rPr>
+          <w:rFonts w:ascii="Times New Roman" w:eastAsia="Times New Roman" w:hAnsi="Times New Roman" w:cs="Times New Roman"/>
+          <w:b/>
+          <w:bCs/>
+          <w:kern w:val="0"/>
+          <w:sz w:val="27"/>
+          <w:szCs w:val="27"/>
+          <w:lang w:eastAsia="en-IN"/>
+          <w14:ligatures w14:val="none"/>
+        </w:rPr>
+        <w:t xml:space="preserve"> Example Request</w:t>
+      </w:r>
+    </w:p>
+    <w:p>
+      <w:pPr>
+        <w:tabs>
+          <w:tab w:val="left" w:pos="916"/>
+          <w:tab w:val="left" w:pos="1832"/>
+          <w:tab w:val="left" w:pos="2748"/>
+          <w:tab w:val="left" w:pos="3664"/>
+          <w:tab w:val="left" w:pos="4580"/>
+          <w:tab w:val="left" w:pos="5496"/>
+          <w:tab w:val="left" w:pos="6412"/>
+          <w:tab w:val="left" w:pos="7328"/>
+          <w:tab w:val="left" w:pos="8244"/>
+          <w:tab w:val="left" w:pos="9160"/>
+          <w:tab w:val="left" w:pos="10076"/>
+          <w:tab w:val="left" w:pos="10992"/>
+          <w:tab w:val="left" w:pos="11908"/>
+          <w:tab w:val="left" w:pos="12824"/>
+          <w:tab w:val="left" w:pos="13740"/>
+          <w:tab w:val="left" w:pos="14656"/>
+        </w:tabs>
+        <w:spacing w:after="0" w:line="240" w:lineRule="auto"/>
+        <w:rPr>
+          <w:rFonts w:ascii="Courier New" w:eastAsia="Times New Roman" w:hAnsi="Courier New" w:cs="Courier New"/>
+          <w:kern w:val="0"/>
+          <w:sz w:val="20"/>
+          <w:szCs w:val="20"/>
+          <w:lang w:eastAsia="en-IN"/>
+          <w14:ligatures w14:val="none"/>
+        </w:rPr>
+      </w:pPr>
+      <w:r>
+        <w:rPr>
+          <w:rFonts w:ascii="Courier New" w:eastAsia="Times New Roman" w:hAnsi="Courier New" w:cs="Courier New"/>
+          <w:kern w:val="0"/>
+          <w:sz w:val="20"/>
+          <w:szCs w:val="20"/>
+          <w:lang w:eastAsia="en-IN"/>
+          <w14:ligatures w14:val="none"/>
+        </w:rPr>
+        <w:t>GET /</w:t>
+      </w:r>
+      <w:proofErr w:type="spellStart"/>
+      <w:r>
+        <w:rPr>
+          <w:rFonts w:ascii="Courier New" w:eastAsia="Times New Roman" w:hAnsi="Courier New" w:cs="Courier New"/>
+          <w:kern w:val="0"/>
+          <w:sz w:val="20"/>
+          <w:szCs w:val="20"/>
+          <w:lang w:eastAsia="en-IN"/>
+          <w14:ligatures w14:val="none"/>
+        </w:rPr>
+        <w:t>api</w:t>
+      </w:r>
+      <w:proofErr w:type="spellEnd"/>
+      <w:r>
+        <w:rPr>
+          <w:rFonts w:ascii="Courier New" w:eastAsia="Times New Roman" w:hAnsi="Courier New" w:cs="Courier New"/>
+          <w:kern w:val="0"/>
+          <w:sz w:val="20"/>
+          <w:szCs w:val="20"/>
+          <w:lang w:eastAsia="en-IN"/>
+          <w14:ligatures w14:val="none"/>
+        </w:rPr>
+        <w:t>/products/machine/MCH_001</w:t>
+      </w:r>
+    </w:p>
+    <w:p>
+      <w:pPr>
+        <w:spacing w:after="0" w:line="240" w:lineRule="auto"/>
+        <w:rPr>
+          <w:rFonts w:ascii="Times New Roman" w:eastAsia="Times New Roman" w:hAnsi="Times New Roman" w:cs="Times New Roman"/>
+          <w:kern w:val="0"/>
+          <w:sz w:val="24"/>
+          <w:szCs w:val="24"/>
+          <w:lang w:eastAsia="en-IN"/>
+          <w14:ligatures w14:val="none"/>
+        </w:rPr>
+      </w:pPr>
+      <w:r>
+        <w:rPr>
+          <w:rFonts w:ascii="Times New Roman" w:eastAsia="Times New Roman" w:hAnsi="Times New Roman" w:cs="Times New Roman"/>
+          <w:kern w:val="0"/>
+          <w:sz w:val="24"/>
+          <w:szCs w:val="24"/>
+          <w:lang w:eastAsia="en-IN"/>
+          <w14:ligatures w14:val="none"/>
+        </w:rPr>
+        <w:pict w14:anchorId="12764F6A">
+          <v:rect id="_x0000_i1042" style="width:0;height:1.5pt" o:hralign="center" o:hrstd="t" o:hr="t" fillcolor="#a0a0a0" stroked="f"/>
+        </w:pict>
+      </w:r>
+    </w:p>
+    <w:p>
+      <w:pPr>
+        <w:spacing w:before="100" w:beforeAutospacing="1" w:after="100" w:afterAutospacing="1" w:line="240" w:lineRule="auto"/>
+        <w:outlineLvl w:val="2"/>
+        <w:rPr>
+          <w:rFonts w:ascii="Times New Roman" w:eastAsia="Times New Roman" w:hAnsi="Times New Roman" w:cs="Times New Roman"/>
+          <w:b/>
+          <w:bCs/>
+          <w:kern w:val="0"/>
+          <w:sz w:val="27"/>
+          <w:szCs w:val="27"/>
+          <w:lang w:eastAsia="en-IN"/>
+          <w14:ligatures w14:val="none"/>
+        </w:rPr>
+      </w:pPr>
+      <w:r>
+        <w:rPr>
+          <w:rFonts w:ascii="Segoe UI Emoji" w:eastAsia="Times New Roman" w:hAnsi="Segoe UI Emoji" w:cs="Segoe UI Emoji"/>
+          <w:b/>
+          <w:bCs/>
+          <w:kern w:val="0"/>
+          <w:sz w:val="27"/>
+          <w:szCs w:val="27"/>
+          <w:lang w:eastAsia="en-IN"/>
+          <w14:ligatures w14:val="none"/>
+        </w:rPr>
+        <w:lastRenderedPageBreak/>
+        <w:t>✅</w:t>
+      </w:r>
+      <w:r>
+        <w:rPr>
+          <w:rFonts w:ascii="Times New Roman" w:eastAsia="Times New Roman" w:hAnsi="Times New Roman" w:cs="Times New Roman"/>
+          <w:b/>
+          <w:bCs/>
+          <w:kern w:val="0"/>
+          <w:sz w:val="27"/>
+          <w:szCs w:val="27"/>
+          <w:lang w:eastAsia="en-IN"/>
+          <w14:ligatures w14:val="none"/>
+        </w:rPr>
+        <w:t xml:space="preserve"> Example Response</w:t>
+      </w:r>
+    </w:p>
+    <w:p>
+      <w:pPr>
+        <w:tabs>
+          <w:tab w:val="left" w:pos="916"/>
+          <w:tab w:val="left" w:pos="1832"/>
+          <w:tab w:val="left" w:pos="2748"/>
+          <w:tab w:val="left" w:pos="3664"/>
+          <w:tab w:val="left" w:pos="4580"/>
+          <w:tab w:val="left" w:pos="5496"/>
+          <w:tab w:val="left" w:pos="6412"/>
+          <w:tab w:val="left" w:pos="7328"/>
+          <w:tab w:val="left" w:pos="8244"/>
+          <w:tab w:val="left" w:pos="9160"/>
+          <w:tab w:val="left" w:pos="10076"/>
+          <w:tab w:val="left" w:pos="10992"/>
+          <w:tab w:val="left" w:pos="11908"/>
+          <w:tab w:val="left" w:pos="12824"/>
+          <w:tab w:val="left" w:pos="13740"/>
+          <w:tab w:val="left" w:pos="14656"/>
+        </w:tabs>
+        <w:spacing w:after="0" w:line="240" w:lineRule="auto"/>
+        <w:rPr>
+          <w:rFonts w:ascii="Courier New" w:eastAsia="Times New Roman" w:hAnsi="Courier New" w:cs="Courier New"/>
+          <w:kern w:val="0"/>
+          <w:sz w:val="20"/>
+          <w:szCs w:val="20"/>
+          <w:lang w:eastAsia="en-IN"/>
+          <w14:ligatures w14:val="none"/>
+        </w:rPr>
+      </w:pPr>
+      <w:r>
+        <w:rPr>
+          <w:rFonts w:ascii="Courier New" w:eastAsia="Times New Roman" w:hAnsi="Courier New" w:cs="Courier New"/>
+          <w:kern w:val="0"/>
+          <w:sz w:val="20"/>
+          <w:szCs w:val="20"/>
+          <w:lang w:eastAsia="en-IN"/>
+          <w14:ligatures w14:val="none"/>
+        </w:rPr>
+        <w:t>{</w:t>
+      </w:r>
+    </w:p>
+    <w:p>
+      <w:pPr>
+        <w:tabs>
+          <w:tab w:val="left" w:pos="916"/>
+          <w:tab w:val="left" w:pos="1832"/>
+          <w:tab w:val="left" w:pos="2748"/>
+          <w:tab w:val="left" w:pos="3664"/>
+          <w:tab w:val="left" w:pos="4580"/>
+          <w:tab w:val="left" w:pos="5496"/>
+          <w:tab w:val="left" w:pos="6412"/>
+          <w:tab w:val="left" w:pos="7328"/>
+          <w:tab w:val="left" w:pos="8244"/>
+          <w:tab w:val="left" w:pos="9160"/>
+          <w:tab w:val="left" w:pos="10076"/>
+          <w:tab w:val="left" w:pos="10992"/>
+          <w:tab w:val="left" w:pos="11908"/>
+          <w:tab w:val="left" w:pos="12824"/>
+          <w:tab w:val="left" w:pos="13740"/>
+          <w:tab w:val="left" w:pos="14656"/>
+        </w:tabs>
+        <w:spacing w:after="0" w:line="240" w:lineRule="auto"/>
+        <w:rPr>
+          <w:rFonts w:ascii="Courier New" w:eastAsia="Times New Roman" w:hAnsi="Courier New" w:cs="Courier New"/>
+          <w:kern w:val="0"/>
+          <w:sz w:val="20"/>
+          <w:szCs w:val="20"/>
+          <w:lang w:eastAsia="en-IN"/>
+          <w14:ligatures w14:val="none"/>
+        </w:rPr>
+      </w:pPr>
+      <w:r>
+        <w:rPr>
+          <w:rFonts w:ascii="Courier New" w:eastAsia="Times New Roman" w:hAnsi="Courier New" w:cs="Courier New"/>
+          <w:kern w:val="0"/>
+          <w:sz w:val="20"/>
+          <w:szCs w:val="20"/>
+          <w:lang w:eastAsia="en-IN"/>
+          <w14:ligatures w14:val="none"/>
+        </w:rPr>
+        <w:t xml:space="preserve">  "</w:t>
+      </w:r>
+      <w:proofErr w:type="spellStart"/>
+      <w:r>
+        <w:rPr>
+          <w:rFonts w:ascii="Courier New" w:eastAsia="Times New Roman" w:hAnsi="Courier New" w:cs="Courier New"/>
+          <w:kern w:val="0"/>
+          <w:sz w:val="20"/>
+          <w:szCs w:val="20"/>
+          <w:lang w:eastAsia="en-IN"/>
+          <w14:ligatures w14:val="none"/>
+        </w:rPr>
+        <w:t>machineCode</w:t>
+      </w:r>
+      <w:proofErr w:type="spellEnd"/>
+      <w:r>
+        <w:rPr>
+          <w:rFonts w:ascii="Courier New" w:eastAsia="Times New Roman" w:hAnsi="Courier New" w:cs="Courier New"/>
+          <w:kern w:val="0"/>
+          <w:sz w:val="20"/>
+          <w:szCs w:val="20"/>
+          <w:lang w:eastAsia="en-IN"/>
+          <w14:ligatures w14:val="none"/>
+        </w:rPr>
+        <w:t>": "MCH_001",</w:t>
+      </w:r>
+    </w:p>
+    <w:p>
+      <w:pPr>
+        <w:tabs>
+          <w:tab w:val="left" w:pos="916"/>
+          <w:tab w:val="left" w:pos="1832"/>
+          <w:tab w:val="left" w:pos="2748"/>
+          <w:tab w:val="left" w:pos="3664"/>
+          <w:tab w:val="left" w:pos="4580"/>
+          <w:tab w:val="left" w:pos="5496"/>
+          <w:tab w:val="left" w:pos="6412"/>
+          <w:tab w:val="left" w:pos="7328"/>
+          <w:tab w:val="left" w:pos="8244"/>
+          <w:tab w:val="left" w:pos="9160"/>
+          <w:tab w:val="left" w:pos="10076"/>
+          <w:tab w:val="left" w:pos="10992"/>
+          <w:tab w:val="left" w:pos="11908"/>
+          <w:tab w:val="left" w:pos="12824"/>
+          <w:tab w:val="left" w:pos="13740"/>
+          <w:tab w:val="left" w:pos="14656"/>
+        </w:tabs>
+        <w:spacing w:after="0" w:line="240" w:lineRule="auto"/>
+        <w:rPr>
+          <w:rFonts w:ascii="Courier New" w:eastAsia="Times New Roman" w:hAnsi="Courier New" w:cs="Courier New"/>
+          <w:kern w:val="0"/>
+          <w:sz w:val="20"/>
+          <w:szCs w:val="20"/>
+          <w:lang w:eastAsia="en-IN"/>
+          <w14:ligatures w14:val="none"/>
+        </w:rPr>
+      </w:pPr>
+      <w:r>
+        <w:rPr>
+          <w:rFonts w:ascii="Courier New" w:eastAsia="Times New Roman" w:hAnsi="Courier New" w:cs="Courier New"/>
+          <w:kern w:val="0"/>
+          <w:sz w:val="20"/>
+          <w:szCs w:val="20"/>
+          <w:lang w:eastAsia="en-IN"/>
+          <w14:ligatures w14:val="none"/>
+        </w:rPr>
+        <w:t xml:space="preserve">  "products": [</w:t>
+      </w:r>
+    </w:p>
+    <w:p>
+      <w:pPr>
+        <w:tabs>
+          <w:tab w:val="left" w:pos="916"/>
+          <w:tab w:val="left" w:pos="1832"/>
+          <w:tab w:val="left" w:pos="2748"/>
+          <w:tab w:val="left" w:pos="3664"/>
+          <w:tab w:val="left" w:pos="4580"/>
+          <w:tab w:val="left" w:pos="5496"/>
+          <w:tab w:val="left" w:pos="6412"/>
+          <w:tab w:val="left" w:pos="7328"/>
+          <w:tab w:val="left" w:pos="8244"/>
+          <w:tab w:val="left" w:pos="9160"/>
+          <w:tab w:val="left" w:pos="10076"/>
+          <w:tab w:val="left" w:pos="10992"/>
+          <w:tab w:val="left" w:pos="11908"/>
+          <w:tab w:val="left" w:pos="12824"/>
+          <w:tab w:val="left" w:pos="13740"/>
+          <w:tab w:val="left" w:pos="14656"/>
+        </w:tabs>
+        <w:spacing w:after="0" w:line="240" w:lineRule="auto"/>
+        <w:rPr>
+          <w:rFonts w:ascii="Courier New" w:eastAsia="Times New Roman" w:hAnsi="Courier New" w:cs="Courier New"/>
+          <w:kern w:val="0"/>
+          <w:sz w:val="20"/>
+          <w:szCs w:val="20"/>
+          <w:lang w:eastAsia="en-IN"/>
+          <w14:ligatures w14:val="none"/>
+        </w:rPr>
+      </w:pPr>
+      <w:r>
+        <w:rPr>
+          <w:rFonts w:ascii="Courier New" w:eastAsia="Times New Roman" w:hAnsi="Courier New" w:cs="Courier New"/>
+          <w:kern w:val="0"/>
+          <w:sz w:val="20"/>
+          <w:szCs w:val="20"/>
+          <w:lang w:eastAsia="en-IN"/>
+          <w14:ligatures w14:val="none"/>
+        </w:rPr>
+        <w:t xml:space="preserve">    {</w:t>
+      </w:r>
+    </w:p>
+    <w:p>
+      <w:pPr>
+        <w:tabs>
+          <w:tab w:val="left" w:pos="916"/>
+          <w:tab w:val="left" w:pos="1832"/>
+          <w:tab w:val="left" w:pos="2748"/>
+          <w:tab w:val="left" w:pos="3664"/>
+          <w:tab w:val="left" w:pos="4580"/>
+          <w:tab w:val="left" w:pos="5496"/>
+          <w:tab w:val="left" w:pos="6412"/>
+          <w:tab w:val="left" w:pos="7328"/>
+          <w:tab w:val="left" w:pos="8244"/>
+          <w:tab w:val="left" w:pos="9160"/>
+          <w:tab w:val="left" w:pos="10076"/>
+          <w:tab w:val="left" w:pos="10992"/>
+          <w:tab w:val="left" w:pos="11908"/>
+          <w:tab w:val="left" w:pos="12824"/>
+          <w:tab w:val="left" w:pos="13740"/>
+          <w:tab w:val="left" w:pos="14656"/>
+        </w:tabs>
+        <w:spacing w:after="0" w:line="240" w:lineRule="auto"/>
+        <w:rPr>
+          <w:rFonts w:ascii="Courier New" w:eastAsia="Times New Roman" w:hAnsi="Courier New" w:cs="Courier New"/>
+          <w:kern w:val="0"/>
+          <w:sz w:val="20"/>
+          <w:szCs w:val="20"/>
+          <w:lang w:eastAsia="en-IN"/>
+          <w14:ligatures w14:val="none"/>
+        </w:rPr>
+      </w:pPr>
+      <w:r>
+        <w:rPr>
+          <w:rFonts w:ascii="Courier New" w:eastAsia="Times New Roman" w:hAnsi="Courier New" w:cs="Courier New"/>
+          <w:kern w:val="0"/>
+          <w:sz w:val="20"/>
+          <w:szCs w:val="20"/>
+          <w:lang w:eastAsia="en-IN"/>
+          <w14:ligatures w14:val="none"/>
+        </w:rPr>
+        <w:t xml:space="preserve">      "code": "PRD_001",</w:t>
+      </w:r>
+    </w:p>
+    <w:p>
+      <w:pPr>
+        <w:tabs>
+          <w:tab w:val="left" w:pos="916"/>
+          <w:tab w:val="left" w:pos="1832"/>
+          <w:tab w:val="left" w:pos="2748"/>
+          <w:tab w:val="left" w:pos="3664"/>
+          <w:tab w:val="left" w:pos="4580"/>
+          <w:tab w:val="left" w:pos="5496"/>
+          <w:tab w:val="left" w:pos="6412"/>
+          <w:tab w:val="left" w:pos="7328"/>
+          <w:tab w:val="left" w:pos="8244"/>
+          <w:tab w:val="left" w:pos="9160"/>
+          <w:tab w:val="left" w:pos="10076"/>
+          <w:tab w:val="left" w:pos="10992"/>
+          <w:tab w:val="left" w:pos="11908"/>
+          <w:tab w:val="left" w:pos="12824"/>
+          <w:tab w:val="left" w:pos="13740"/>
+          <w:tab w:val="left" w:pos="14656"/>
+        </w:tabs>
+        <w:spacing w:after="0" w:line="240" w:lineRule="auto"/>
+        <w:rPr>
+          <w:rFonts w:ascii="Courier New" w:eastAsia="Times New Roman" w:hAnsi="Courier New" w:cs="Courier New"/>
+          <w:kern w:val="0"/>
+          <w:sz w:val="20"/>
+          <w:szCs w:val="20"/>
+          <w:lang w:eastAsia="en-IN"/>
+          <w14:ligatures w14:val="none"/>
+        </w:rPr>
+      </w:pPr>
+      <w:r>
+        <w:rPr>
+          <w:rFonts w:ascii="Courier New" w:eastAsia="Times New Roman" w:hAnsi="Courier New" w:cs="Courier New"/>
+          <w:kern w:val="0"/>
+          <w:sz w:val="20"/>
+          <w:szCs w:val="20"/>
+          <w:lang w:eastAsia="en-IN"/>
+          <w14:ligatures w14:val="none"/>
+        </w:rPr>
+        <w:t xml:space="preserve">      "name": "Handle Assembly"</w:t>
+      </w:r>
+    </w:p>
+    <w:p>
+      <w:pPr>
+        <w:tabs>
+          <w:tab w:val="left" w:pos="916"/>
+          <w:tab w:val="left" w:pos="1832"/>
+          <w:tab w:val="left" w:pos="2748"/>
+          <w:tab w:val="left" w:pos="3664"/>
+          <w:tab w:val="left" w:pos="4580"/>
+          <w:tab w:val="left" w:pos="5496"/>
+          <w:tab w:val="left" w:pos="6412"/>
+          <w:tab w:val="left" w:pos="7328"/>
+          <w:tab w:val="left" w:pos="8244"/>
+          <w:tab w:val="left" w:pos="9160"/>
+          <w:tab w:val="left" w:pos="10076"/>
+          <w:tab w:val="left" w:pos="10992"/>
+          <w:tab w:val="left" w:pos="11908"/>
+          <w:tab w:val="left" w:pos="12824"/>
+          <w:tab w:val="left" w:pos="13740"/>
+          <w:tab w:val="left" w:pos="14656"/>
+        </w:tabs>
+        <w:spacing w:after="0" w:line="240" w:lineRule="auto"/>
+        <w:rPr>
+          <w:rFonts w:ascii="Courier New" w:eastAsia="Times New Roman" w:hAnsi="Courier New" w:cs="Courier New"/>
+          <w:kern w:val="0"/>
+          <w:sz w:val="20"/>
+          <w:szCs w:val="20"/>
+          <w:lang w:eastAsia="en-IN"/>
+          <w14:ligatures w14:val="none"/>
+        </w:rPr>
+      </w:pPr>
+      <w:r>
+        <w:rPr>
+          <w:rFonts w:ascii="Courier New" w:eastAsia="Times New Roman" w:hAnsi="Courier New" w:cs="Courier New"/>
+          <w:kern w:val="0"/>
+          <w:sz w:val="20"/>
+          <w:szCs w:val="20"/>
+          <w:lang w:eastAsia="en-IN"/>
+          <w14:ligatures w14:val="none"/>
+        </w:rPr>
+        <w:t xml:space="preserve">    },</w:t>
+      </w:r>
+    </w:p>
+    <w:p>
+      <w:pPr>
+        <w:tabs>
+          <w:tab w:val="left" w:pos="916"/>
+          <w:tab w:val="left" w:pos="1832"/>
+          <w:tab w:val="left" w:pos="2748"/>
+          <w:tab w:val="left" w:pos="3664"/>
+          <w:tab w:val="left" w:pos="4580"/>
+          <w:tab w:val="left" w:pos="5496"/>
+          <w:tab w:val="left" w:pos="6412"/>
+          <w:tab w:val="left" w:pos="7328"/>
+          <w:tab w:val="left" w:pos="8244"/>
+          <w:tab w:val="left" w:pos="9160"/>
+          <w:tab w:val="left" w:pos="10076"/>
+          <w:tab w:val="left" w:pos="10992"/>
+          <w:tab w:val="left" w:pos="11908"/>
+          <w:tab w:val="left" w:pos="12824"/>
+          <w:tab w:val="left" w:pos="13740"/>
+          <w:tab w:val="left" w:pos="14656"/>
+        </w:tabs>
+        <w:spacing w:after="0" w:line="240" w:lineRule="auto"/>
+        <w:rPr>
+          <w:rFonts w:ascii="Courier New" w:eastAsia="Times New Roman" w:hAnsi="Courier New" w:cs="Courier New"/>
+          <w:kern w:val="0"/>
+          <w:sz w:val="20"/>
+          <w:szCs w:val="20"/>
+          <w:lang w:eastAsia="en-IN"/>
+          <w14:ligatures w14:val="none"/>
+        </w:rPr>
+      </w:pPr>
+      <w:r>
+        <w:rPr>
+          <w:rFonts w:ascii="Courier New" w:eastAsia="Times New Roman" w:hAnsi="Courier New" w:cs="Courier New"/>
+          <w:kern w:val="0"/>
+          <w:sz w:val="20"/>
+          <w:szCs w:val="20"/>
+          <w:lang w:eastAsia="en-IN"/>
+          <w14:ligatures w14:val="none"/>
+        </w:rPr>
+        <w:t xml:space="preserve">    {</w:t>
+      </w:r>
+    </w:p>
+    <w:p>
+      <w:pPr>
+        <w:tabs>
+          <w:tab w:val="left" w:pos="916"/>
+          <w:tab w:val="left" w:pos="1832"/>
+          <w:tab w:val="left" w:pos="2748"/>
+          <w:tab w:val="left" w:pos="3664"/>
+          <w:tab w:val="left" w:pos="4580"/>
+          <w:tab w:val="left" w:pos="5496"/>
+          <w:tab w:val="left" w:pos="6412"/>
+          <w:tab w:val="left" w:pos="7328"/>
+          <w:tab w:val="left" w:pos="8244"/>
+          <w:tab w:val="left" w:pos="9160"/>
+          <w:tab w:val="left" w:pos="10076"/>
+          <w:tab w:val="left" w:pos="10992"/>
+          <w:tab w:val="left" w:pos="11908"/>
+          <w:tab w:val="left" w:pos="12824"/>
+          <w:tab w:val="left" w:pos="13740"/>
+          <w:tab w:val="left" w:pos="14656"/>
+        </w:tabs>
+        <w:spacing w:after="0" w:line="240" w:lineRule="auto"/>
+        <w:rPr>
+          <w:rFonts w:ascii="Courier New" w:eastAsia="Times New Roman" w:hAnsi="Courier New" w:cs="Courier New"/>
+          <w:kern w:val="0"/>
+          <w:sz w:val="20"/>
+          <w:szCs w:val="20"/>
+          <w:lang w:eastAsia="en-IN"/>
+          <w14:ligatures w14:val="none"/>
+        </w:rPr>
+      </w:pPr>
+      <w:r>
+        <w:rPr>
+          <w:rFonts w:ascii="Courier New" w:eastAsia="Times New Roman" w:hAnsi="Courier New" w:cs="Courier New"/>
+          <w:kern w:val="0"/>
+          <w:sz w:val="20"/>
+          <w:szCs w:val="20"/>
+          <w:lang w:eastAsia="en-IN"/>
+          <w14:ligatures w14:val="none"/>
+        </w:rPr>
+        <w:t xml:space="preserve">      "code": "PRD_002",</w:t>
+      </w:r>
+    </w:p>
+    <w:p>
+      <w:pPr>
+        <w:tabs>
+          <w:tab w:val="left" w:pos="916"/>
+          <w:tab w:val="left" w:pos="1832"/>
+          <w:tab w:val="left" w:pos="2748"/>
+          <w:tab w:val="left" w:pos="3664"/>
+          <w:tab w:val="left" w:pos="4580"/>
+          <w:tab w:val="left" w:pos="5496"/>
+          <w:tab w:val="left" w:pos="6412"/>
+          <w:tab w:val="left" w:pos="7328"/>
+          <w:tab w:val="left" w:pos="8244"/>
+          <w:tab w:val="left" w:pos="9160"/>
+          <w:tab w:val="left" w:pos="10076"/>
+          <w:tab w:val="left" w:pos="10992"/>
+          <w:tab w:val="left" w:pos="11908"/>
+          <w:tab w:val="left" w:pos="12824"/>
+          <w:tab w:val="left" w:pos="13740"/>
+          <w:tab w:val="left" w:pos="14656"/>
+        </w:tabs>
+        <w:spacing w:after="0" w:line="240" w:lineRule="auto"/>
+        <w:rPr>
+          <w:rFonts w:ascii="Courier New" w:eastAsia="Times New Roman" w:hAnsi="Courier New" w:cs="Courier New"/>
+          <w:kern w:val="0"/>
+          <w:sz w:val="20"/>
+          <w:szCs w:val="20"/>
+          <w:lang w:eastAsia="en-IN"/>
+          <w14:ligatures w14:val="none"/>
+        </w:rPr>
+      </w:pPr>
+      <w:r>
+        <w:rPr>
+          <w:rFonts w:ascii="Courier New" w:eastAsia="Times New Roman" w:hAnsi="Courier New" w:cs="Courier New"/>
+          <w:kern w:val="0"/>
+          <w:sz w:val="20"/>
+          <w:szCs w:val="20"/>
+          <w:lang w:eastAsia="en-IN"/>
+          <w14:ligatures w14:val="none"/>
+        </w:rPr>
+        <w:t xml:space="preserve">      "name": "Body Frame"</w:t>
+      </w:r>
+    </w:p>
+    <w:p>
+      <w:pPr>
+        <w:tabs>
+          <w:tab w:val="left" w:pos="916"/>
+          <w:tab w:val="left" w:pos="1832"/>
+          <w:tab w:val="left" w:pos="2748"/>
+          <w:tab w:val="left" w:pos="3664"/>
+          <w:tab w:val="left" w:pos="4580"/>
+          <w:tab w:val="left" w:pos="5496"/>
+          <w:tab w:val="left" w:pos="6412"/>
+          <w:tab w:val="left" w:pos="7328"/>
+          <w:tab w:val="left" w:pos="8244"/>
+          <w:tab w:val="left" w:pos="9160"/>
+          <w:tab w:val="left" w:pos="10076"/>
+          <w:tab w:val="left" w:pos="10992"/>
+          <w:tab w:val="left" w:pos="11908"/>
+          <w:tab w:val="left" w:pos="12824"/>
+          <w:tab w:val="left" w:pos="13740"/>
+          <w:tab w:val="left" w:pos="14656"/>
+        </w:tabs>
+        <w:spacing w:after="0" w:line="240" w:lineRule="auto"/>
+        <w:rPr>
+          <w:rFonts w:ascii="Courier New" w:eastAsia="Times New Roman" w:hAnsi="Courier New" w:cs="Courier New"/>
+          <w:kern w:val="0"/>
+          <w:sz w:val="20"/>
+          <w:szCs w:val="20"/>
+          <w:lang w:eastAsia="en-IN"/>
+          <w14:ligatures w14:val="none"/>
+        </w:rPr>
+      </w:pPr>
+      <w:r>
+        <w:rPr>
+          <w:rFonts w:ascii="Courier New" w:eastAsia="Times New Roman" w:hAnsi="Courier New" w:cs="Courier New"/>
+          <w:kern w:val="0"/>
+          <w:sz w:val="20"/>
+          <w:szCs w:val="20"/>
+          <w:lang w:eastAsia="en-IN"/>
+          <w14:ligatures w14:val="none"/>
+        </w:rPr>
+        <w:t xml:space="preserve">    }</w:t>
+      </w:r>
+    </w:p>
+    <w:p>
+      <w:pPr>
+        <w:tabs>
+          <w:tab w:val="left" w:pos="916"/>
+          <w:tab w:val="left" w:pos="1832"/>
+          <w:tab w:val="left" w:pos="2748"/>
+          <w:tab w:val="left" w:pos="3664"/>
+          <w:tab w:val="left" w:pos="4580"/>
+          <w:tab w:val="left" w:pos="5496"/>
+          <w:tab w:val="left" w:pos="6412"/>
+          <w:tab w:val="left" w:pos="7328"/>
+          <w:tab w:val="left" w:pos="8244"/>
+          <w:tab w:val="left" w:pos="9160"/>
+          <w:tab w:val="left" w:pos="10076"/>
+          <w:tab w:val="left" w:pos="10992"/>
+          <w:tab w:val="left" w:pos="11908"/>
+          <w:tab w:val="left" w:pos="12824"/>
+          <w:tab w:val="left" w:pos="13740"/>
+          <w:tab w:val="left" w:pos="14656"/>
+        </w:tabs>
+        <w:spacing w:after="0" w:line="240" w:lineRule="auto"/>
+        <w:rPr>
+          <w:rFonts w:ascii="Courier New" w:eastAsia="Times New Roman" w:hAnsi="Courier New" w:cs="Courier New"/>
+          <w:kern w:val="0"/>
+          <w:sz w:val="20"/>
+          <w:szCs w:val="20"/>
+          <w:lang w:eastAsia="en-IN"/>
+          <w14:ligatures w14:val="none"/>
+        </w:rPr>
+      </w:pPr>
+      <w:r>
+        <w:rPr>
+          <w:rFonts w:ascii="Courier New" w:eastAsia="Times New Roman" w:hAnsi="Courier New" w:cs="Courier New"/>
+          <w:kern w:val="0"/>
+          <w:sz w:val="20"/>
+          <w:szCs w:val="20"/>
+          <w:lang w:eastAsia="en-IN"/>
+          <w14:ligatures w14:val="none"/>
+        </w:rPr>
+        <w:t xml:space="preserve">  ]</w:t>
+      </w:r>
+    </w:p>
+    <w:p>
+      <w:pPr>
+        <w:tabs>
+          <w:tab w:val="left" w:pos="916"/>
+          <w:tab w:val="left" w:pos="1832"/>
+          <w:tab w:val="left" w:pos="2748"/>
+          <w:tab w:val="left" w:pos="3664"/>
+          <w:tab w:val="left" w:pos="4580"/>
+          <w:tab w:val="left" w:pos="5496"/>
+          <w:tab w:val="left" w:pos="6412"/>
+          <w:tab w:val="left" w:pos="7328"/>
+          <w:tab w:val="left" w:pos="8244"/>
+          <w:tab w:val="left" w:pos="9160"/>
+          <w:tab w:val="left" w:pos="10076"/>
+          <w:tab w:val="left" w:pos="10992"/>
+          <w:tab w:val="left" w:pos="11908"/>
+          <w:tab w:val="left" w:pos="12824"/>
+          <w:tab w:val="left" w:pos="13740"/>
+          <w:tab w:val="left" w:pos="14656"/>
+        </w:tabs>
+        <w:spacing w:after="0" w:line="240" w:lineRule="auto"/>
+        <w:rPr>
+          <w:rFonts w:ascii="Courier New" w:eastAsia="Times New Roman" w:hAnsi="Courier New" w:cs="Courier New"/>
+          <w:kern w:val="0"/>
+          <w:sz w:val="20"/>
+          <w:szCs w:val="20"/>
+          <w:lang w:eastAsia="en-IN"/>
+          <w14:ligatures w14:val="none"/>
+        </w:rPr>
+      </w:pPr>
+      <w:r>
+        <w:rPr>
+          <w:rFonts w:ascii="Courier New" w:eastAsia="Times New Roman" w:hAnsi="Courier New" w:cs="Courier New"/>
+          <w:kern w:val="0"/>
+          <w:sz w:val="20"/>
+          <w:szCs w:val="20"/>
+          <w:lang w:eastAsia="en-IN"/>
+          <w14:ligatures w14:val="none"/>
+        </w:rPr>
+        <w:t>}</w:t>
+      </w:r>
+    </w:p>
+    <w:p>
+      <w:pPr>
+        <w:spacing w:after="0" w:line="240" w:lineRule="auto"/>
+        <w:rPr>
+          <w:rFonts w:ascii="Times New Roman" w:eastAsia="Times New Roman" w:hAnsi="Times New Roman" w:cs="Times New Roman"/>
+          <w:kern w:val="0"/>
+          <w:sz w:val="24"/>
+          <w:szCs w:val="24"/>
+          <w:lang w:eastAsia="en-IN"/>
+          <w14:ligatures w14:val="none"/>
+        </w:rPr>
+      </w:pPr>
+      <w:r>
+        <w:rPr>
+          <w:rFonts w:ascii="Times New Roman" w:eastAsia="Times New Roman" w:hAnsi="Times New Roman" w:cs="Times New Roman"/>
+          <w:kern w:val="0"/>
+          <w:sz w:val="24"/>
+          <w:szCs w:val="24"/>
+          <w:lang w:eastAsia="en-IN"/>
+          <w14:ligatures w14:val="none"/>
+        </w:rPr>
+        <w:pict w14:anchorId="5FD13FC4">
+          <v:rect id="_x0000_i1043" style="width:0;height:1.5pt" o:hralign="center" o:hrstd="t" o:hr="t" fillcolor="#a0a0a0" stroked="f"/>
+        </w:pict>
+      </w:r>
+    </w:p>
+    <w:p>
+      <w:pPr>
+        <w:spacing w:before="100" w:beforeAutospacing="1" w:after="100" w:afterAutospacing="1" w:line="240" w:lineRule="auto"/>
+        <w:outlineLvl w:val="2"/>
+        <w:rPr>
+          <w:rFonts w:ascii="Times New Roman" w:eastAsia="Times New Roman" w:hAnsi="Times New Roman" w:cs="Times New Roman"/>
+          <w:b/>
+          <w:bCs/>
+          <w:kern w:val="0"/>
+          <w:sz w:val="27"/>
+          <w:szCs w:val="27"/>
+          <w:lang w:eastAsia="en-IN"/>
+          <w14:ligatures w14:val="none"/>
+        </w:rPr>
+      </w:pPr>
+      <w:r>
+        <w:rPr>
+          <w:rFonts w:ascii="Segoe UI Emoji" w:eastAsia="Times New Roman" w:hAnsi="Segoe UI Emoji" w:cs="Segoe UI Emoji"/>
+          <w:b/>
+          <w:bCs/>
+          <w:kern w:val="0"/>
+          <w:sz w:val="27"/>
+          <w:szCs w:val="27"/>
+          <w:lang w:eastAsia="en-IN"/>
+          <w14:ligatures w14:val="none"/>
+        </w:rPr>
+        <w:t>🚫</w:t>
+      </w:r>
+      <w:r>
+        <w:rPr>
+          <w:rFonts w:ascii="Times New Roman" w:eastAsia="Times New Roman" w:hAnsi="Times New Roman" w:cs="Times New Roman"/>
+          <w:b/>
+          <w:bCs/>
+          <w:kern w:val="0"/>
+          <w:sz w:val="27"/>
+          <w:szCs w:val="27"/>
+          <w:lang w:eastAsia="en-IN"/>
+          <w14:ligatures w14:val="none"/>
+        </w:rPr>
+        <w:t xml:space="preserve"> Error Response Example</w:t>
+      </w:r>
+    </w:p>
+    <w:p>
+      <w:pPr>
+        <w:tabs>
+          <w:tab w:val="left" w:pos="916"/>
+          <w:tab w:val="left" w:pos="1832"/>
+          <w:tab w:val="left" w:pos="2748"/>
+          <w:tab w:val="left" w:pos="3664"/>
+          <w:tab w:val="left" w:pos="4580"/>
+          <w:tab w:val="left" w:pos="5496"/>
+          <w:tab w:val="left" w:pos="6412"/>
+          <w:tab w:val="left" w:pos="7328"/>
+          <w:tab w:val="left" w:pos="8244"/>
+          <w:tab w:val="left" w:pos="9160"/>
+          <w:tab w:val="left" w:pos="10076"/>
+          <w:tab w:val="left" w:pos="10992"/>
+          <w:tab w:val="left" w:pos="11908"/>
+          <w:tab w:val="left" w:pos="12824"/>
+          <w:tab w:val="left" w:pos="13740"/>
+          <w:tab w:val="left" w:pos="14656"/>
+        </w:tabs>
+        <w:spacing w:after="0" w:line="240" w:lineRule="auto"/>
+        <w:rPr>
+          <w:rFonts w:ascii="Courier New" w:eastAsia="Times New Roman" w:hAnsi="Courier New" w:cs="Courier New"/>
+          <w:kern w:val="0"/>
+          <w:sz w:val="20"/>
+          <w:szCs w:val="20"/>
+          <w:lang w:eastAsia="en-IN"/>
+          <w14:ligatures w14:val="none"/>
+        </w:rPr>
+      </w:pPr>
+      <w:r>
+        <w:rPr>
+          <w:rFonts w:ascii="Courier New" w:eastAsia="Times New Roman" w:hAnsi="Courier New" w:cs="Courier New"/>
+          <w:kern w:val="0"/>
+          <w:sz w:val="20"/>
+          <w:szCs w:val="20"/>
+          <w:lang w:eastAsia="en-IN"/>
+          <w14:ligatures w14:val="none"/>
+        </w:rPr>
+        <w:t>{</w:t>
+      </w:r>
+    </w:p>
+    <w:p>
+      <w:pPr>
+        <w:tabs>
+          <w:tab w:val="left" w:pos="916"/>
+          <w:tab w:val="left" w:pos="1832"/>
+          <w:tab w:val="left" w:pos="2748"/>
+          <w:tab w:val="left" w:pos="3664"/>
+          <w:tab w:val="left" w:pos="4580"/>
+          <w:tab w:val="left" w:pos="5496"/>
+          <w:tab w:val="left" w:pos="6412"/>
+          <w:tab w:val="left" w:pos="7328"/>
+          <w:tab w:val="left" w:pos="8244"/>
+          <w:tab w:val="left" w:pos="9160"/>
+          <w:tab w:val="left" w:pos="10076"/>
+          <w:tab w:val="left" w:pos="10992"/>
+          <w:tab w:val="left" w:pos="11908"/>
+          <w:tab w:val="left" w:pos="12824"/>
+          <w:tab w:val="left" w:pos="13740"/>
+          <w:tab w:val="left" w:pos="14656"/>
+        </w:tabs>
+        <w:spacing w:after="0" w:line="240" w:lineRule="auto"/>
+        <w:rPr>
+          <w:rFonts w:ascii="Courier New" w:eastAsia="Times New Roman" w:hAnsi="Courier New" w:cs="Courier New"/>
+          <w:kern w:val="0"/>
+          <w:sz w:val="20"/>
+          <w:szCs w:val="20"/>
+          <w:lang w:eastAsia="en-IN"/>
+          <w14:ligatures w14:val="none"/>
+        </w:rPr>
+      </w:pPr>
+      <w:r>
+        <w:rPr>
+          <w:rFonts w:ascii="Courier New" w:eastAsia="Times New Roman" w:hAnsi="Courier New" w:cs="Courier New"/>
+          <w:kern w:val="0"/>
+          <w:sz w:val="20"/>
+          <w:szCs w:val="20"/>
+          <w:lang w:eastAsia="en-IN"/>
+          <w14:ligatures w14:val="none"/>
+        </w:rPr>
+        <w:t xml:space="preserve">  "error": "Error fetching products with names"</w:t>
+      </w:r>
+    </w:p>
+    <w:p>
+      <w:pPr>
+        <w:tabs>
+          <w:tab w:val="left" w:pos="916"/>
+          <w:tab w:val="left" w:pos="1832"/>
+          <w:tab w:val="left" w:pos="2748"/>
+          <w:tab w:val="left" w:pos="3664"/>
+          <w:tab w:val="left" w:pos="4580"/>
+          <w:tab w:val="left" w:pos="5496"/>
+          <w:tab w:val="left" w:pos="6412"/>
+          <w:tab w:val="left" w:pos="7328"/>
+          <w:tab w:val="left" w:pos="8244"/>
+          <w:tab w:val="left" w:pos="9160"/>
+          <w:tab w:val="left" w:pos="10076"/>
+          <w:tab w:val="left" w:pos="10992"/>
+          <w:tab w:val="left" w:pos="11908"/>
+          <w:tab w:val="left" w:pos="12824"/>
+          <w:tab w:val="left" w:pos="13740"/>
+          <w:tab w:val="left" w:pos="14656"/>
+        </w:tabs>
+        <w:spacing w:after="0" w:line="240" w:lineRule="auto"/>
+        <w:rPr>
+          <w:rFonts w:ascii="Courier New" w:eastAsia="Times New Roman" w:hAnsi="Courier New" w:cs="Courier New"/>
+          <w:kern w:val="0"/>
+          <w:sz w:val="20"/>
+          <w:szCs w:val="20"/>
+          <w:lang w:eastAsia="en-IN"/>
+          <w14:ligatures w14:val="none"/>
+        </w:rPr>
+      </w:pPr>
+      <w:r>
+        <w:rPr>
+          <w:rFonts w:ascii="Courier New" w:eastAsia="Times New Roman" w:hAnsi="Courier New" w:cs="Courier New"/>
+          <w:kern w:val="0"/>
+          <w:sz w:val="20"/>
+          <w:szCs w:val="20"/>
+          <w:lang w:eastAsia="en-IN"/>
+          <w14:ligatures w14:val="none"/>
+        </w:rPr>
+        <w:t>}</w:t>
+      </w:r>
+    </w:p>
+    <w:p>
+      <w:pPr>
+        <w:spacing w:after="0" w:line="240" w:lineRule="auto"/>
+        <w:rPr>
+          <w:rFonts w:ascii="Times New Roman" w:eastAsia="Times New Roman" w:hAnsi="Times New Roman" w:cs="Times New Roman"/>
+          <w:kern w:val="0"/>
+          <w:sz w:val="24"/>
+          <w:szCs w:val="24"/>
+          <w:lang w:eastAsia="en-IN"/>
+          <w14:ligatures w14:val="none"/>
+        </w:rPr>
+      </w:pPr>
+      <w:r>
+        <w:rPr>
+          <w:rFonts w:ascii="Times New Roman" w:eastAsia="Times New Roman" w:hAnsi="Times New Roman" w:cs="Times New Roman"/>
+          <w:kern w:val="0"/>
+          <w:sz w:val="24"/>
+          <w:szCs w:val="24"/>
+          <w:lang w:eastAsia="en-IN"/>
+          <w14:ligatures w14:val="none"/>
+        </w:rPr>
+        <w:pict w14:anchorId="79882D1F">
+          <v:rect id="_x0000_i1044" style="width:0;height:1.5pt" o:hralign="center" o:hrstd="t" o:hr="t" fillcolor="#a0a0a0" stroked="f"/>
+        </w:pict>
+      </w:r>
+    </w:p>
+    <w:p>
+      <w:pPr>
+        <w:spacing w:before="100" w:beforeAutospacing="1" w:after="100" w:afterAutospacing="1" w:line="240" w:lineRule="auto"/>
+        <w:outlineLvl w:val="2"/>
+        <w:rPr>
+          <w:rFonts w:ascii="Times New Roman" w:eastAsia="Times New Roman" w:hAnsi="Times New Roman" w:cs="Times New Roman"/>
+          <w:b/>
+          <w:bCs/>
+          <w:kern w:val="0"/>
+          <w:sz w:val="27"/>
+          <w:szCs w:val="27"/>
+          <w:lang w:eastAsia="en-IN"/>
+          <w14:ligatures w14:val="none"/>
+        </w:rPr>
+      </w:pPr>
+      <w:r>
+        <w:rPr>
+          <w:rFonts w:ascii="Segoe UI Emoji" w:eastAsia="Times New Roman" w:hAnsi="Segoe UI Emoji" w:cs="Segoe UI Emoji"/>
+          <w:b/>
+          <w:bCs/>
+          <w:kern w:val="0"/>
+          <w:sz w:val="27"/>
+          <w:szCs w:val="27"/>
+          <w:lang w:eastAsia="en-IN"/>
+          <w14:ligatures w14:val="none"/>
+        </w:rPr>
+        <w:t>🧪</w:t>
+      </w:r>
+      <w:r>
+        <w:rPr>
+          <w:rFonts w:ascii="Times New Roman" w:eastAsia="Times New Roman" w:hAnsi="Times New Roman" w:cs="Times New Roman"/>
+          <w:b/>
+          <w:bCs/>
+          <w:kern w:val="0"/>
+          <w:sz w:val="27"/>
+          <w:szCs w:val="27"/>
+          <w:lang w:eastAsia="en-IN"/>
+          <w14:ligatures w14:val="none"/>
+        </w:rPr>
+        <w:t xml:space="preserve"> Postman Test Steps</w:t>
+      </w:r>
+    </w:p>
+    <w:p>
+      <w:pPr>
+        <w:numPr>
+          <w:ilvl w:val="0"/>
+          <w:numId w:val="4"/>
+        </w:numPr>
+        <w:spacing w:before="100" w:beforeAutospacing="1" w:after="100" w:afterAutospacing="1" w:line="240" w:lineRule="auto"/>
+        <w:rPr>
+          <w:rFonts w:ascii="Times New Roman" w:eastAsia="Times New Roman" w:hAnsi="Times New Roman" w:cs="Times New Roman"/>
+          <w:kern w:val="0"/>
+          <w:sz w:val="24"/>
+          <w:szCs w:val="24"/>
+          <w:lang w:eastAsia="en-IN"/>
+          <w14:ligatures w14:val="none"/>
+        </w:rPr>
+      </w:pPr>
+      <w:r>
+        <w:rPr>
+          <w:rFonts w:ascii="Times New Roman" w:eastAsia="Times New Roman" w:hAnsi="Times New Roman" w:cs="Times New Roman"/>
+          <w:kern w:val="0"/>
+          <w:sz w:val="24"/>
+          <w:szCs w:val="24"/>
+          <w:lang w:eastAsia="en-IN"/>
+          <w14:ligatures w14:val="none"/>
+        </w:rPr>
+        <w:t>Open Postman</w:t>
+      </w:r>
+    </w:p>
+    <w:p>
+      <w:pPr>
+        <w:numPr>
+          <w:ilvl w:val="0"/>
+          <w:numId w:val="4"/>
+        </w:numPr>
+        <w:spacing w:before="100" w:beforeAutospacing="1" w:after="100" w:afterAutospacing="1" w:line="240" w:lineRule="auto"/>
+        <w:rPr>
+          <w:rFonts w:ascii="Times New Roman" w:eastAsia="Times New Roman" w:hAnsi="Times New Roman" w:cs="Times New Roman"/>
+          <w:kern w:val="0"/>
+          <w:sz w:val="24"/>
+          <w:szCs w:val="24"/>
+          <w:lang w:eastAsia="en-IN"/>
+          <w14:ligatures w14:val="none"/>
+        </w:rPr>
+      </w:pPr>
+      <w:r>
+        <w:rPr>
+          <w:rFonts w:ascii="Times New Roman" w:eastAsia="Times New Roman" w:hAnsi="Times New Roman" w:cs="Times New Roman"/>
+          <w:kern w:val="0"/>
+          <w:sz w:val="24"/>
+          <w:szCs w:val="24"/>
+          <w:lang w:eastAsia="en-IN"/>
+          <w14:ligatures w14:val="none"/>
+        </w:rPr>
+        <w:t xml:space="preserve">Set method to </w:t>
+      </w:r>
+      <w:r>
+        <w:rPr>
+          <w:rFonts w:ascii="Courier New" w:eastAsia="Times New Roman" w:hAnsi="Courier New" w:cs="Courier New"/>
+          <w:kern w:val="0"/>
+          <w:sz w:val="20"/>
+          <w:szCs w:val="20"/>
+          <w:lang w:eastAsia="en-IN"/>
+          <w14:ligatures w14:val="none"/>
+        </w:rPr>
+        <w:t>GET</w:t>
+      </w:r>
+    </w:p>
+    <w:p>
+      <w:pPr>
+        <w:numPr>
+          <w:ilvl w:val="0"/>
+          <w:numId w:val="4"/>
+        </w:numPr>
+        <w:spacing w:before="100" w:beforeAutospacing="1" w:after="100" w:afterAutospacing="1" w:line="240" w:lineRule="auto"/>
+        <w:rPr>
+          <w:rFonts w:ascii="Times New Roman" w:eastAsia="Times New Roman" w:hAnsi="Times New Roman" w:cs="Times New Roman"/>
+          <w:kern w:val="0"/>
+          <w:sz w:val="24"/>
+          <w:szCs w:val="24"/>
+          <w:lang w:eastAsia="en-IN"/>
+          <w14:ligatures w14:val="none"/>
+        </w:rPr>
+      </w:pPr>
+      <w:r>
+        <w:rPr>
+          <w:rFonts w:ascii="Times New Roman" w:eastAsia="Times New Roman" w:hAnsi="Times New Roman" w:cs="Times New Roman"/>
+          <w:kern w:val="0"/>
+          <w:sz w:val="24"/>
+          <w:szCs w:val="24"/>
+          <w:lang w:eastAsia="en-IN"/>
+          <w14:ligatures w14:val="none"/>
+        </w:rPr>
+        <w:t>Enter the URL:</w:t>
+      </w:r>
+    </w:p>
+    <w:p>
+      <w:pPr>
+        <w:numPr>
+          <w:ilvl w:val="0"/>
+          <w:numId w:val="4"/>
+        </w:numPr>
+        <w:tabs>
+          <w:tab w:val="clear" w:pos="720"/>
+          <w:tab w:val="left" w:pos="916"/>
+          <w:tab w:val="left" w:pos="1832"/>
+          <w:tab w:val="left" w:pos="2748"/>
+          <w:tab w:val="left" w:pos="3664"/>
+          <w:tab w:val="left" w:pos="4580"/>
+          <w:tab w:val="left" w:pos="5496"/>
+          <w:tab w:val="left" w:pos="6412"/>
+          <w:tab w:val="left" w:pos="7328"/>
+          <w:tab w:val="left" w:pos="8244"/>
+          <w:tab w:val="left" w:pos="9160"/>
+          <w:tab w:val="left" w:pos="10076"/>
+          <w:tab w:val="left" w:pos="10992"/>
+          <w:tab w:val="left" w:pos="11908"/>
+          <w:tab w:val="left" w:pos="12824"/>
+          <w:tab w:val="left" w:pos="13740"/>
+          <w:tab w:val="left" w:pos="14656"/>
+        </w:tabs>
+        <w:spacing w:after="0" w:line="240" w:lineRule="auto"/>
+        <w:rPr>
+          <w:rFonts w:ascii="Courier New" w:eastAsia="Times New Roman" w:hAnsi="Courier New" w:cs="Courier New"/>
+          <w:kern w:val="0"/>
+          <w:sz w:val="20"/>
+          <w:szCs w:val="20"/>
+          <w:lang w:eastAsia="en-IN"/>
+          <w14:ligatures w14:val="none"/>
+        </w:rPr>
+      </w:pPr>
+      <w:r>
+        <w:rPr>
+          <w:rFonts w:ascii="Courier New" w:eastAsia="Times New Roman" w:hAnsi="Courier New" w:cs="Courier New"/>
+          <w:kern w:val="0"/>
+          <w:sz w:val="20"/>
+          <w:szCs w:val="20"/>
+          <w:lang w:eastAsia="en-IN"/>
+          <w14:ligatures w14:val="none"/>
+        </w:rPr>
+        <w:t>http://localhost:3000/api/products/machine/MCH_001</w:t>
+      </w:r>
+    </w:p>
+    <w:p>
+      <w:pPr>
+        <w:spacing w:before="100" w:beforeAutospacing="1" w:after="100" w:afterAutospacing="1" w:line="240" w:lineRule="auto"/>
+        <w:ind w:left="720"/>
+        <w:rPr>
+          <w:rFonts w:ascii="Times New Roman" w:eastAsia="Times New Roman" w:hAnsi="Times New Roman" w:cs="Times New Roman"/>
+          <w:kern w:val="0"/>
+          <w:sz w:val="24"/>
+          <w:szCs w:val="24"/>
+          <w:lang w:eastAsia="en-IN"/>
+          <w14:ligatures w14:val="none"/>
+        </w:rPr>
+      </w:pPr>
+      <w:r>
+        <w:rPr>
+          <w:rFonts w:ascii="Times New Roman" w:eastAsia="Times New Roman" w:hAnsi="Times New Roman" w:cs="Times New Roman"/>
+          <w:kern w:val="0"/>
+          <w:sz w:val="24"/>
+          <w:szCs w:val="24"/>
+          <w:lang w:eastAsia="en-IN"/>
+          <w14:ligatures w14:val="none"/>
+        </w:rPr>
+        <w:t xml:space="preserve">Replace </w:t>
+      </w:r>
+      <w:r>
+        <w:rPr>
+          <w:rFonts w:ascii="Courier New" w:eastAsia="Times New Roman" w:hAnsi="Courier New" w:cs="Courier New"/>
+          <w:kern w:val="0"/>
+          <w:sz w:val="20"/>
+          <w:szCs w:val="20"/>
+          <w:lang w:eastAsia="en-IN"/>
+          <w14:ligatures w14:val="none"/>
+        </w:rPr>
+        <w:t>MCH_001</w:t>
+      </w:r>
+      <w:r>
+        <w:rPr>
+          <w:rFonts w:ascii="Times New Roman" w:eastAsia="Times New Roman" w:hAnsi="Times New Roman" w:cs="Times New Roman"/>
+          <w:kern w:val="0"/>
+          <w:sz w:val="24"/>
+          <w:szCs w:val="24"/>
+          <w:lang w:eastAsia="en-IN"/>
+          <w14:ligatures w14:val="none"/>
+        </w:rPr>
+        <w:t xml:space="preserve"> with your actual machine code.</w:t>
+      </w:r>
+    </w:p>
+    <w:p>
+      <w:pPr>
+        <w:numPr>
+          <w:ilvl w:val="0"/>
+          <w:numId w:val="4"/>
+        </w:numPr>
+        <w:spacing w:before="100" w:beforeAutospacing="1" w:after="100" w:afterAutospacing="1" w:line="240" w:lineRule="auto"/>
+        <w:rPr>
+          <w:rFonts w:ascii="Times New Roman" w:eastAsia="Times New Roman" w:hAnsi="Times New Roman" w:cs="Times New Roman"/>
+          <w:kern w:val="0"/>
+          <w:sz w:val="24"/>
+          <w:szCs w:val="24"/>
+          <w:lang w:eastAsia="en-IN"/>
+          <w14:ligatures w14:val="none"/>
+        </w:rPr>
+      </w:pPr>
+      <w:r>
+        <w:rPr>
+          <w:rFonts w:ascii="Times New Roman" w:eastAsia="Times New Roman" w:hAnsi="Times New Roman" w:cs="Times New Roman"/>
+          <w:kern w:val="0"/>
+          <w:sz w:val="24"/>
+          <w:szCs w:val="24"/>
+          <w:lang w:eastAsia="en-IN"/>
+          <w14:ligatures w14:val="none"/>
+        </w:rPr>
+        <w:t xml:space="preserve">Click </w:t>
+      </w:r>
+      <w:r>
+        <w:rPr>
+          <w:rFonts w:ascii="Times New Roman" w:eastAsia="Times New Roman" w:hAnsi="Times New Roman" w:cs="Times New Roman"/>
+          <w:b/>
+          <w:bCs/>
+          <w:kern w:val="0"/>
+          <w:sz w:val="24"/>
+          <w:szCs w:val="24"/>
+          <w:lang w:eastAsia="en-IN"/>
+          <w14:ligatures w14:val="none"/>
+        </w:rPr>
+        <w:t>Send</w:t>
+      </w:r>
+    </w:p>
+    <w:p>
+      <w:pPr>
+        <w:numPr>
+          <w:ilvl w:val="0"/>
+          <w:numId w:val="4"/>
+        </w:numPr>
+        <w:spacing w:before="100" w:beforeAutospacing="1" w:after="100" w:afterAutospacing="1" w:line="240" w:lineRule="auto"/>
+        <w:rPr>
+          <w:rFonts w:ascii="Times New Roman" w:eastAsia="Times New Roman" w:hAnsi="Times New Roman" w:cs="Times New Roman"/>
+          <w:kern w:val="0"/>
+          <w:sz w:val="24"/>
+          <w:szCs w:val="24"/>
+          <w:lang w:eastAsia="en-IN"/>
+          <w14:ligatures w14:val="none"/>
+        </w:rPr>
+      </w:pPr>
+      <w:r>
+        <w:rPr>
+          <w:rFonts w:ascii="Times New Roman" w:eastAsia="Times New Roman" w:hAnsi="Times New Roman" w:cs="Times New Roman"/>
+          <w:kern w:val="0"/>
+          <w:sz w:val="24"/>
+          <w:szCs w:val="24"/>
+          <w:lang w:eastAsia="en-IN"/>
+          <w14:ligatures w14:val="none"/>
+        </w:rPr>
+        <w:t xml:space="preserve">You should see a list of </w:t>
+      </w:r>
+      <w:r>
+        <w:rPr>
+          <w:rFonts w:ascii="Courier New" w:eastAsia="Times New Roman" w:hAnsi="Courier New" w:cs="Courier New"/>
+          <w:kern w:val="0"/>
+          <w:sz w:val="20"/>
+          <w:szCs w:val="20"/>
+          <w:lang w:eastAsia="en-IN"/>
+          <w14:ligatures w14:val="none"/>
+        </w:rPr>
+        <w:t>code</w:t>
+      </w:r>
+      <w:r>
+        <w:rPr>
+          <w:rFonts w:ascii="Times New Roman" w:eastAsia="Times New Roman" w:hAnsi="Times New Roman" w:cs="Times New Roman"/>
+          <w:kern w:val="0"/>
+          <w:sz w:val="24"/>
+          <w:szCs w:val="24"/>
+          <w:lang w:eastAsia="en-IN"/>
+          <w14:ligatures w14:val="none"/>
+        </w:rPr>
+        <w:t xml:space="preserve"> and </w:t>
+      </w:r>
+      <w:r>
+        <w:rPr>
+          <w:rFonts w:ascii="Courier New" w:eastAsia="Times New Roman" w:hAnsi="Courier New" w:cs="Courier New"/>
+          <w:kern w:val="0"/>
+          <w:sz w:val="20"/>
+          <w:szCs w:val="20"/>
+          <w:lang w:eastAsia="en-IN"/>
+          <w14:ligatures w14:val="none"/>
+        </w:rPr>
+        <w:t>name</w:t>
+      </w:r>
+      <w:r>
+        <w:rPr>
+          <w:rFonts w:ascii="Times New Roman" w:eastAsia="Times New Roman" w:hAnsi="Times New Roman" w:cs="Times New Roman"/>
+          <w:kern w:val="0"/>
+          <w:sz w:val="24"/>
+          <w:szCs w:val="24"/>
+          <w:lang w:eastAsia="en-IN"/>
+          <w14:ligatures w14:val="none"/>
+        </w:rPr>
+        <w:t xml:space="preserve"> pairs for products linked to the machine.</w:t>
+      </w:r>
+    </w:p>
+    <w:p>
+      <w:pPr>
+        <w:spacing w:after="0" w:line="240" w:lineRule="auto"/>
+        <w:rPr>
+          <w:rFonts w:ascii="Times New Roman" w:eastAsia="Times New Roman" w:hAnsi="Times New Roman" w:cs="Times New Roman"/>
+          <w:kern w:val="0"/>
+          <w:sz w:val="24"/>
+          <w:szCs w:val="24"/>
+          <w:lang w:eastAsia="en-IN"/>
+          <w14:ligatures w14:val="none"/>
+        </w:rPr>
+      </w:pPr>
+      <w:r>
+        <w:rPr>
+          <w:rFonts w:ascii="Times New Roman" w:eastAsia="Times New Roman" w:hAnsi="Times New Roman" w:cs="Times New Roman"/>
+          <w:kern w:val="0"/>
+          <w:sz w:val="24"/>
+          <w:szCs w:val="24"/>
+          <w:lang w:eastAsia="en-IN"/>
+          <w14:ligatures w14:val="none"/>
+        </w:rPr>
+        <w:pict w14:anchorId="7838062E">
+          <v:rect id="_x0000_i1045" style="width:0;height:1.5pt" o:hralign="center" o:hrstd="t" o:hr="t" fillcolor="#a0a0a0" stroked="f"/>
+        </w:pict>
+      </w:r>
+    </w:p>
+    <w:p>
+      <w:pPr>
+        <w:spacing w:before="100" w:beforeAutospacing="1" w:after="100" w:afterAutospacing="1" w:line="240" w:lineRule="auto"/>
+        <w:outlineLvl w:val="2"/>
+        <w:rPr>
+          <w:rFonts w:ascii="Times New Roman" w:eastAsia="Times New Roman" w:hAnsi="Times New Roman" w:cs="Times New Roman"/>
+          <w:b/>
+          <w:bCs/>
+          <w:kern w:val="0"/>
+          <w:sz w:val="27"/>
+          <w:szCs w:val="27"/>
+          <w:lang w:eastAsia="en-IN"/>
+          <w14:ligatures w14:val="none"/>
+        </w:rPr>
+      </w:pPr>
+      <w:r>
+        <w:rPr>
+          <w:rFonts w:ascii="Segoe UI Symbol" w:eastAsia="Times New Roman" w:hAnsi="Segoe UI Symbol" w:cs="Segoe UI Symbol"/>
+          <w:b/>
+          <w:bCs/>
+          <w:kern w:val="0"/>
+          <w:sz w:val="27"/>
+          <w:szCs w:val="27"/>
+          <w:lang w:eastAsia="en-IN"/>
+          <w14:ligatures w14:val="none"/>
+        </w:rPr>
+        <w:t>🛠</w:t>
+      </w:r>
+      <w:r>
+        <w:rPr>
+          <w:rFonts w:ascii="Times New Roman" w:eastAsia="Times New Roman" w:hAnsi="Times New Roman" w:cs="Times New Roman"/>
+          <w:b/>
+          <w:bCs/>
+          <w:kern w:val="0"/>
+          <w:sz w:val="27"/>
+          <w:szCs w:val="27"/>
+          <w:lang w:eastAsia="en-IN"/>
+          <w14:ligatures w14:val="none"/>
+        </w:rPr>
+        <w:t xml:space="preserve"> Notes for Frontend Developer</w:t>
+      </w:r>
+    </w:p>
+    <w:p>
+      <w:pPr>
+        <w:numPr>
+          <w:ilvl w:val="0"/>
+          <w:numId w:val="5"/>
+        </w:numPr>
+        <w:spacing w:before="100" w:beforeAutospacing="1" w:after="100" w:afterAutospacing="1" w:line="240" w:lineRule="auto"/>
+        <w:rPr>
+          <w:rFonts w:ascii="Times New Roman" w:eastAsia="Times New Roman" w:hAnsi="Times New Roman" w:cs="Times New Roman"/>
+          <w:kern w:val="0"/>
+          <w:sz w:val="24"/>
+          <w:szCs w:val="24"/>
+          <w:lang w:eastAsia="en-IN"/>
+          <w14:ligatures w14:val="none"/>
+        </w:rPr>
+      </w:pPr>
+      <w:r>
+        <w:rPr>
+          <w:rFonts w:ascii="Times New Roman" w:eastAsia="Times New Roman" w:hAnsi="Times New Roman" w:cs="Times New Roman"/>
+          <w:kern w:val="0"/>
+          <w:sz w:val="24"/>
+          <w:szCs w:val="24"/>
+          <w:lang w:eastAsia="en-IN"/>
+          <w14:ligatures w14:val="none"/>
+        </w:rPr>
+        <w:t>Use this API when rendering a list of products tied to a specific machine.</w:t>
+      </w:r>
+    </w:p>
+    <w:p>
+      <w:pPr>
+        <w:numPr>
+          <w:ilvl w:val="0"/>
+          <w:numId w:val="5"/>
+        </w:numPr>
+        <w:spacing w:before="100" w:beforeAutospacing="1" w:after="100" w:afterAutospacing="1" w:line="240" w:lineRule="auto"/>
+        <w:rPr>
+          <w:rFonts w:ascii="Times New Roman" w:eastAsia="Times New Roman" w:hAnsi="Times New Roman" w:cs="Times New Roman"/>
+          <w:kern w:val="0"/>
+          <w:sz w:val="24"/>
+          <w:szCs w:val="24"/>
+          <w:lang w:eastAsia="en-IN"/>
+          <w14:ligatures w14:val="none"/>
+        </w:rPr>
+      </w:pPr>
+      <w:r>
+        <w:rPr>
+          <w:rFonts w:ascii="Times New Roman" w:eastAsia="Times New Roman" w:hAnsi="Times New Roman" w:cs="Times New Roman"/>
+          <w:kern w:val="0"/>
+          <w:sz w:val="24"/>
+          <w:szCs w:val="24"/>
+          <w:lang w:eastAsia="en-IN"/>
+          <w14:ligatures w14:val="none"/>
+        </w:rPr>
+        <w:t>It's helpful for filtering content or instructions dynamically.</w:t>
+      </w:r>
+    </w:p>
+    <w:p>
+      <w:pPr>
+        <w:numPr>
+          <w:ilvl w:val="0"/>
+          <w:numId w:val="5"/>
+        </w:numPr>
+        <w:spacing w:before="100" w:beforeAutospacing="1" w:after="100" w:afterAutospacing="1" w:line="240" w:lineRule="auto"/>
+        <w:rPr>
+          <w:rFonts w:ascii="Times New Roman" w:eastAsia="Times New Roman" w:hAnsi="Times New Roman" w:cs="Times New Roman"/>
+          <w:kern w:val="0"/>
+          <w:sz w:val="24"/>
+          <w:szCs w:val="24"/>
+          <w:lang w:eastAsia="en-IN"/>
+          <w14:ligatures w14:val="none"/>
+        </w:rPr>
+      </w:pPr>
+      <w:r>
+        <w:rPr>
+          <w:rFonts w:ascii="Times New Roman" w:eastAsia="Times New Roman" w:hAnsi="Times New Roman" w:cs="Times New Roman"/>
+          <w:kern w:val="0"/>
+          <w:sz w:val="24"/>
+          <w:szCs w:val="24"/>
+          <w:lang w:eastAsia="en-IN"/>
+          <w14:ligatures w14:val="none"/>
+        </w:rPr>
+        <w:t xml:space="preserve">Use the </w:t>
+      </w:r>
+      <w:r>
+        <w:rPr>
+          <w:rFonts w:ascii="Courier New" w:eastAsia="Times New Roman" w:hAnsi="Courier New" w:cs="Courier New"/>
+          <w:kern w:val="0"/>
+          <w:sz w:val="20"/>
+          <w:szCs w:val="20"/>
+          <w:lang w:eastAsia="en-IN"/>
+          <w14:ligatures w14:val="none"/>
+        </w:rPr>
+        <w:t>code</w:t>
+      </w:r>
+      <w:r>
+        <w:rPr>
+          <w:rFonts w:ascii="Times New Roman" w:eastAsia="Times New Roman" w:hAnsi="Times New Roman" w:cs="Times New Roman"/>
+          <w:kern w:val="0"/>
+          <w:sz w:val="24"/>
+          <w:szCs w:val="24"/>
+          <w:lang w:eastAsia="en-IN"/>
+          <w14:ligatures w14:val="none"/>
+        </w:rPr>
+        <w:t xml:space="preserve"> field when querying other APIs (like work instructions).</w:t>
+      </w:r>
+    </w:p>
+    <w:p>
+      <w:pPr>
+        <w:numPr>
+          <w:ilvl w:val="0"/>
+          <w:numId w:val="5"/>
+        </w:numPr>
+        <w:spacing w:before="100" w:beforeAutospacing="1" w:after="100" w:afterAutospacing="1" w:line="240" w:lineRule="auto"/>
+        <w:rPr>
+          <w:rFonts w:ascii="Times New Roman" w:eastAsia="Times New Roman" w:hAnsi="Times New Roman" w:cs="Times New Roman"/>
+          <w:kern w:val="0"/>
+          <w:sz w:val="24"/>
+          <w:szCs w:val="24"/>
+          <w:lang w:eastAsia="en-IN"/>
+          <w14:ligatures w14:val="none"/>
+        </w:rPr>
+      </w:pPr>
+      <w:r>
+        <w:rPr>
+          <w:rFonts w:ascii="Times New Roman" w:eastAsia="Times New Roman" w:hAnsi="Times New Roman" w:cs="Times New Roman"/>
+          <w:kern w:val="0"/>
+          <w:sz w:val="24"/>
+          <w:szCs w:val="24"/>
+          <w:lang w:eastAsia="en-IN"/>
+          <w14:ligatures w14:val="none"/>
+        </w:rPr>
+        <w:t xml:space="preserve">Display the </w:t>
+      </w:r>
+      <w:r>
+        <w:rPr>
+          <w:rFonts w:ascii="Courier New" w:eastAsia="Times New Roman" w:hAnsi="Courier New" w:cs="Courier New"/>
+          <w:kern w:val="0"/>
+          <w:sz w:val="20"/>
+          <w:szCs w:val="20"/>
+          <w:lang w:eastAsia="en-IN"/>
+          <w14:ligatures w14:val="none"/>
+        </w:rPr>
+        <w:t>name</w:t>
+      </w:r>
+      <w:r>
+        <w:rPr>
+          <w:rFonts w:ascii="Times New Roman" w:eastAsia="Times New Roman" w:hAnsi="Times New Roman" w:cs="Times New Roman"/>
+          <w:kern w:val="0"/>
+          <w:sz w:val="24"/>
+          <w:szCs w:val="24"/>
+          <w:lang w:eastAsia="en-IN"/>
+          <w14:ligatures w14:val="none"/>
+        </w:rPr>
+        <w:t xml:space="preserve"> field in UI (for readability).</w:t>
+      </w:r>
+    </w:p>
+    <w:p>
+      <w:pPr>
+        <w:spacing w:after="0" w:line="240" w:lineRule="auto"/>
+        <w:rPr>
+          <w:rFonts w:ascii="Times New Roman" w:eastAsia="Times New Roman" w:hAnsi="Times New Roman" w:cs="Times New Roman"/>
+          <w:kern w:val="0"/>
+          <w:sz w:val="24"/>
+          <w:szCs w:val="24"/>
+          <w:lang w:eastAsia="en-IN"/>
+          <w14:ligatures w14:val="none"/>
+        </w:rPr>
+      </w:pPr>
+      <w:r>
+        <w:rPr>
+          <w:rFonts w:ascii="Times New Roman" w:eastAsia="Times New Roman" w:hAnsi="Times New Roman" w:cs="Times New Roman"/>
+          <w:kern w:val="0"/>
+          <w:sz w:val="24"/>
+          <w:szCs w:val="24"/>
+          <w:lang w:eastAsia="en-IN"/>
+          <w14:ligatures w14:val="none"/>
+        </w:rPr>
+        <w:pict w14:anchorId="1851FFBC">
+          <v:rect id="_x0000_i1046" style="width:0;height:1.5pt" o:hralign="center" o:hrstd="t" o:hr="t" fillcolor="#a0a0a0" stroked="f"/>
+        </w:pict>
+      </w:r>
+    </w:p>
+    <w:p>
+      <w:pPr>
+        <w:spacing w:before="100" w:beforeAutospacing="1" w:after="100" w:afterAutospacing="1" w:line="240" w:lineRule="auto"/>
+        <w:rPr>
+          <w:rFonts w:ascii="Times New Roman" w:eastAsia="Times New Roman" w:hAnsi="Times New Roman" w:cs="Times New Roman"/>
+          <w:kern w:val="0"/>
+          <w:sz w:val="24"/>
+          <w:szCs w:val="24"/>
+          <w:lang w:eastAsia="en-IN"/>
+          <w14:ligatures w14:val="none"/>
+        </w:rPr>
+      </w:pPr>
+      <w:r>
+        <w:rPr>
+          <w:rFonts w:ascii="Times New Roman" w:eastAsia="Times New Roman" w:hAnsi="Times New Roman" w:cs="Times New Roman"/>
+          <w:kern w:val="0"/>
+          <w:sz w:val="24"/>
+          <w:szCs w:val="24"/>
+          <w:lang w:eastAsia="en-IN"/>
+          <w14:ligatures w14:val="none"/>
+        </w:rPr>
+        <w:t xml:space="preserve">Let me know if you’d also like documentation for the </w:t>
+      </w:r>
+      <w:r>
+        <w:rPr>
+          <w:rFonts w:ascii="Courier New" w:eastAsia="Times New Roman" w:hAnsi="Courier New" w:cs="Courier New"/>
+          <w:kern w:val="0"/>
+          <w:sz w:val="20"/>
+          <w:szCs w:val="20"/>
+          <w:lang w:eastAsia="en-IN"/>
+          <w14:ligatures w14:val="none"/>
+        </w:rPr>
+        <w:t>/</w:t>
+      </w:r>
+      <w:proofErr w:type="spellStart"/>
+      <w:r>
+        <w:rPr>
+          <w:rFonts w:ascii="Courier New" w:eastAsia="Times New Roman" w:hAnsi="Courier New" w:cs="Courier New"/>
+          <w:kern w:val="0"/>
+          <w:sz w:val="20"/>
+          <w:szCs w:val="20"/>
+          <w:lang w:eastAsia="en-IN"/>
+          <w14:ligatures w14:val="none"/>
+        </w:rPr>
+        <w:t>api</w:t>
+      </w:r>
+      <w:proofErr w:type="spellEnd"/>
+      <w:r>
+        <w:rPr>
+          <w:rFonts w:ascii="Courier New" w:eastAsia="Times New Roman" w:hAnsi="Courier New" w:cs="Courier New"/>
+          <w:kern w:val="0"/>
+          <w:sz w:val="20"/>
+          <w:szCs w:val="20"/>
+          <w:lang w:eastAsia="en-IN"/>
+          <w14:ligatures w14:val="none"/>
+        </w:rPr>
+        <w:t>/products</w:t>
+      </w:r>
+      <w:r>
+        <w:rPr>
+          <w:rFonts w:ascii="Times New Roman" w:eastAsia="Times New Roman" w:hAnsi="Times New Roman" w:cs="Times New Roman"/>
+          <w:kern w:val="0"/>
+          <w:sz w:val="24"/>
+          <w:szCs w:val="24"/>
+          <w:lang w:eastAsia="en-IN"/>
+          <w14:ligatures w14:val="none"/>
+        </w:rPr>
+        <w:t xml:space="preserve"> route to add/manage products — or if you want to bundle this into a central API doc sheet for the project.</w:t>
+      </w:r>
+    </w:p>
+    <w:p/>
     <w:sectPr>
       <w:pgSz w:w="11906" w:h="16838"/>
       <w:pgMar w:top="1440" w:right="1440" w:bottom="1440" w:left="1440" w:header="708" w:footer="708" w:gutter="0"/>
@@ -7874,9 +10379,9 @@
 <file path=word/numbering.xml><?xml version="1.0" encoding="utf-8"?>
 <w:numbering xmlns:wpc="http://schemas.microsoft.com/office/word/2010/wordprocessingCanvas" xmlns:cx="http://schemas.microsoft.com/office/drawing/2014/chartex" xmlns:cx1="http://schemas.microsoft.com/office/drawing/2015/9/8/chartex" xmlns:cx2="http://schemas.microsoft.com/office/drawing/2015/10/21/chartex" xmlns:cx3="http://schemas.microsoft.com/office/drawing/2016/5/9/chartex" xmlns:cx4="http://schemas.microsoft.com/office/drawing/2016/5/10/chartex" xmlns:cx5="http://schemas.microsoft.com/office/drawing/2016/5/11/chartex" xmlns:cx6="http://schemas.microsoft.com/office/drawing/2016/5/12/chartex" xmlns:cx7="http://schemas.microsoft.com/office/drawing/2016/5/13/chartex" xmlns:cx8="http://schemas.microsoft.com/office/drawing/2016/5/14/chartex" xmlns:mc="http://schemas.openxmlformats.org/markup-compatibility/2006" xmlns:aink="http://schemas.microsoft.com/office/drawing/2016/ink" xmlns:am3d="http://schemas.microsoft.com/office/drawing/2017/model3d" xmlns:o="urn:schemas-microsoft-com:office:office" xmlns:oel="http://schemas.microsoft.com/office/2019/extlst" xmlns:r="http://schemas.openxmlformats.org/officeDocument/2006/relationships" xmlns:m="http://schemas.openxmlformats.org/officeDocument/2006/math" xmlns:v="urn:schemas-microsoft-com:vml" xmlns:wp14="http://schemas.microsoft.com/office/word/2010/wordprocessingDrawing" xmlns:wp="http://schemas.openxmlformats.org/drawingml/2006/wordprocessingDrawing" xmlns:w10="urn:schemas-microsoft-com:office:word" xmlns:w="http://schemas.openxmlformats.org/wordprocessingml/2006/main" xmlns:w14="http://schemas.microsoft.com/office/word/2010/wordml" xmlns:w15="http://schemas.microsoft.com/office/word/2012/wordml" xmlns:w16cex="http://schemas.microsoft.com/office/word/2018/wordml/cex" xmlns:w16cid="http://schemas.microsoft.com/office/word/2016/wordml/cid" xmlns:w16="http://schemas.microsoft.com/office/word/2018/wordml" xmlns:w16du="http://schemas.microsoft.com/office/word/2023/wordml/word16du" xmlns:w16sdtdh="http://schemas.microsoft.com/office/word/2020/wordml/sdtdatahash" xmlns:w16se="http://schemas.microsoft.com/office/word/2015/wordml/symex" xmlns:wpg="http://schemas.microsoft.com/office/word/2010/wordprocessingGroup" xmlns:wpi="http://schemas.microsoft.com/office/word/2010/wordprocessingInk" xmlns:wne="http://schemas.microsoft.com/office/word/2006/wordml" xmlns:wps="http://schemas.microsoft.com/office/word/2010/wordprocessingShape" mc:Ignorable="w14 w15 w16se w16cid w16 w16cex w16sdtdh w16du wp14">
   <w:abstractNum w:abstractNumId="0" w15:restartNumberingAfterBreak="0">
-    <w:nsid w:val="31E85315"/>
+    <w:nsid w:val="06E076C0"/>
     <w:multiLevelType w:val="multilevel"/>
-    <w:tmpl w:val="4C607C16"/>
+    <w:tmpl w:val="E6D6436E"/>
     <w:lvl w:ilvl="0">
       <w:start w:val="1"/>
       <w:numFmt w:val="bullet"/>
@@ -8023,9 +10528,122 @@
     </w:lvl>
   </w:abstractNum>
   <w:abstractNum w:abstractNumId="1" w15:restartNumberingAfterBreak="0">
-    <w:nsid w:val="49340382"/>
+    <w:nsid w:val="2D0F53A7"/>
     <w:multiLevelType w:val="multilevel"/>
-    <w:tmpl w:val="A07A0850"/>
+    <w:tmpl w:val="C73E0D9A"/>
+    <w:lvl w:ilvl="0">
+      <w:start w:val="1"/>
+      <w:numFmt w:val="decimal"/>
+      <w:lvlText w:val="%1."/>
+      <w:lvlJc w:val="left"/>
+      <w:pPr>
+        <w:tabs>
+          <w:tab w:val="num" w:pos="720"/>
+        </w:tabs>
+        <w:ind w:left="720" w:hanging="360"/>
+      </w:pPr>
+    </w:lvl>
+    <w:lvl w:ilvl="1" w:tentative="1">
+      <w:start w:val="1"/>
+      <w:numFmt w:val="decimal"/>
+      <w:lvlText w:val="%2."/>
+      <w:lvlJc w:val="left"/>
+      <w:pPr>
+        <w:tabs>
+          <w:tab w:val="num" w:pos="1440"/>
+        </w:tabs>
+        <w:ind w:left="1440" w:hanging="360"/>
+      </w:pPr>
+    </w:lvl>
+    <w:lvl w:ilvl="2" w:tentative="1">
+      <w:start w:val="1"/>
+      <w:numFmt w:val="decimal"/>
+      <w:lvlText w:val="%3."/>
+      <w:lvlJc w:val="left"/>
+      <w:pPr>
+        <w:tabs>
+          <w:tab w:val="num" w:pos="2160"/>
+        </w:tabs>
+        <w:ind w:left="2160" w:hanging="360"/>
+      </w:pPr>
+    </w:lvl>
+    <w:lvl w:ilvl="3" w:tentative="1">
+      <w:start w:val="1"/>
+      <w:numFmt w:val="decimal"/>
+      <w:lvlText w:val="%4."/>
+      <w:lvlJc w:val="left"/>
+      <w:pPr>
+        <w:tabs>
+          <w:tab w:val="num" w:pos="2880"/>
+        </w:tabs>
+        <w:ind w:left="2880" w:hanging="360"/>
+      </w:pPr>
+    </w:lvl>
+    <w:lvl w:ilvl="4" w:tentative="1">
+      <w:start w:val="1"/>
+      <w:numFmt w:val="decimal"/>
+      <w:lvlText w:val="%5."/>
+      <w:lvlJc w:val="left"/>
+      <w:pPr>
+        <w:tabs>
+          <w:tab w:val="num" w:pos="3600"/>
+        </w:tabs>
+        <w:ind w:left="3600" w:hanging="360"/>
+      </w:pPr>
+    </w:lvl>
+    <w:lvl w:ilvl="5" w:tentative="1">
+      <w:start w:val="1"/>
+      <w:numFmt w:val="decimal"/>
+      <w:lvlText w:val="%6."/>
+      <w:lvlJc w:val="left"/>
+      <w:pPr>
+        <w:tabs>
+          <w:tab w:val="num" w:pos="4320"/>
+        </w:tabs>
+        <w:ind w:left="4320" w:hanging="360"/>
+      </w:pPr>
+    </w:lvl>
+    <w:lvl w:ilvl="6" w:tentative="1">
+      <w:start w:val="1"/>
+      <w:numFmt w:val="decimal"/>
+      <w:lvlText w:val="%7."/>
+      <w:lvlJc w:val="left"/>
+      <w:pPr>
+        <w:tabs>
+          <w:tab w:val="num" w:pos="5040"/>
+        </w:tabs>
+        <w:ind w:left="5040" w:hanging="360"/>
+      </w:pPr>
+    </w:lvl>
+    <w:lvl w:ilvl="7" w:tentative="1">
+      <w:start w:val="1"/>
+      <w:numFmt w:val="decimal"/>
+      <w:lvlText w:val="%8."/>
+      <w:lvlJc w:val="left"/>
+      <w:pPr>
+        <w:tabs>
+          <w:tab w:val="num" w:pos="5760"/>
+        </w:tabs>
+        <w:ind w:left="5760" w:hanging="360"/>
+      </w:pPr>
+    </w:lvl>
+    <w:lvl w:ilvl="8" w:tentative="1">
+      <w:start w:val="1"/>
+      <w:numFmt w:val="decimal"/>
+      <w:lvlText w:val="%9."/>
+      <w:lvlJc w:val="left"/>
+      <w:pPr>
+        <w:tabs>
+          <w:tab w:val="num" w:pos="6480"/>
+        </w:tabs>
+        <w:ind w:left="6480" w:hanging="360"/>
+      </w:pPr>
+    </w:lvl>
+  </w:abstractNum>
+  <w:abstractNum w:abstractNumId="2" w15:restartNumberingAfterBreak="0">
+    <w:nsid w:val="31E85315"/>
+    <w:multiLevelType w:val="multilevel"/>
+    <w:tmpl w:val="4C607C16"/>
     <w:lvl w:ilvl="0">
       <w:start w:val="1"/>
       <w:numFmt w:val="bullet"/>
@@ -8171,7 +10789,156 @@
       </w:rPr>
     </w:lvl>
   </w:abstractNum>
-  <w:abstractNum w:abstractNumId="2" w15:restartNumberingAfterBreak="0">
+  <w:abstractNum w:abstractNumId="3" w15:restartNumberingAfterBreak="0">
+    <w:nsid w:val="49340382"/>
+    <w:multiLevelType w:val="multilevel"/>
+    <w:tmpl w:val="A07A0850"/>
+    <w:lvl w:ilvl="0">
+      <w:start w:val="1"/>
+      <w:numFmt w:val="bullet"/>
+      <w:lvlText w:val=""/>
+      <w:lvlJc w:val="left"/>
+      <w:pPr>
+        <w:tabs>
+          <w:tab w:val="num" w:pos="720"/>
+        </w:tabs>
+        <w:ind w:left="720" w:hanging="360"/>
+      </w:pPr>
+      <w:rPr>
+        <w:rFonts w:ascii="Symbol" w:hAnsi="Symbol" w:hint="default"/>
+        <w:sz w:val="20"/>
+      </w:rPr>
+    </w:lvl>
+    <w:lvl w:ilvl="1" w:tentative="1">
+      <w:start w:val="1"/>
+      <w:numFmt w:val="bullet"/>
+      <w:lvlText w:val="o"/>
+      <w:lvlJc w:val="left"/>
+      <w:pPr>
+        <w:tabs>
+          <w:tab w:val="num" w:pos="1440"/>
+        </w:tabs>
+        <w:ind w:left="1440" w:hanging="360"/>
+      </w:pPr>
+      <w:rPr>
+        <w:rFonts w:ascii="Courier New" w:hAnsi="Courier New" w:hint="default"/>
+        <w:sz w:val="20"/>
+      </w:rPr>
+    </w:lvl>
+    <w:lvl w:ilvl="2" w:tentative="1">
+      <w:start w:val="1"/>
+      <w:numFmt w:val="bullet"/>
+      <w:lvlText w:val=""/>
+      <w:lvlJc w:val="left"/>
+      <w:pPr>
+        <w:tabs>
+          <w:tab w:val="num" w:pos="2160"/>
+        </w:tabs>
+        <w:ind w:left="2160" w:hanging="360"/>
+      </w:pPr>
+      <w:rPr>
+        <w:rFonts w:ascii="Wingdings" w:hAnsi="Wingdings" w:hint="default"/>
+        <w:sz w:val="20"/>
+      </w:rPr>
+    </w:lvl>
+    <w:lvl w:ilvl="3" w:tentative="1">
+      <w:start w:val="1"/>
+      <w:numFmt w:val="bullet"/>
+      <w:lvlText w:val=""/>
+      <w:lvlJc w:val="left"/>
+      <w:pPr>
+        <w:tabs>
+          <w:tab w:val="num" w:pos="2880"/>
+        </w:tabs>
+        <w:ind w:left="2880" w:hanging="360"/>
+      </w:pPr>
+      <w:rPr>
+        <w:rFonts w:ascii="Wingdings" w:hAnsi="Wingdings" w:hint="default"/>
+        <w:sz w:val="20"/>
+      </w:rPr>
+    </w:lvl>
+    <w:lvl w:ilvl="4" w:tentative="1">
+      <w:start w:val="1"/>
+      <w:numFmt w:val="bullet"/>
+      <w:lvlText w:val=""/>
+      <w:lvlJc w:val="left"/>
+      <w:pPr>
+        <w:tabs>
+          <w:tab w:val="num" w:pos="3600"/>
+        </w:tabs>
+        <w:ind w:left="3600" w:hanging="360"/>
+      </w:pPr>
+      <w:rPr>
+        <w:rFonts w:ascii="Wingdings" w:hAnsi="Wingdings" w:hint="default"/>
+        <w:sz w:val="20"/>
+      </w:rPr>
+    </w:lvl>
+    <w:lvl w:ilvl="5" w:tentative="1">
+      <w:start w:val="1"/>
+      <w:numFmt w:val="bullet"/>
+      <w:lvlText w:val=""/>
+      <w:lvlJc w:val="left"/>
+      <w:pPr>
+        <w:tabs>
+          <w:tab w:val="num" w:pos="4320"/>
+        </w:tabs>
+        <w:ind w:left="4320" w:hanging="360"/>
+      </w:pPr>
+      <w:rPr>
+        <w:rFonts w:ascii="Wingdings" w:hAnsi="Wingdings" w:hint="default"/>
+        <w:sz w:val="20"/>
+      </w:rPr>
+    </w:lvl>
+    <w:lvl w:ilvl="6" w:tentative="1">
+      <w:start w:val="1"/>
+      <w:numFmt w:val="bullet"/>
+      <w:lvlText w:val=""/>
+      <w:lvlJc w:val="left"/>
+      <w:pPr>
+        <w:tabs>
+          <w:tab w:val="num" w:pos="5040"/>
+        </w:tabs>
+        <w:ind w:left="5040" w:hanging="360"/>
+      </w:pPr>
+      <w:rPr>
+        <w:rFonts w:ascii="Wingdings" w:hAnsi="Wingdings" w:hint="default"/>
+        <w:sz w:val="20"/>
+      </w:rPr>
+    </w:lvl>
+    <w:lvl w:ilvl="7" w:tentative="1">
+      <w:start w:val="1"/>
+      <w:numFmt w:val="bullet"/>
+      <w:lvlText w:val=""/>
+      <w:lvlJc w:val="left"/>
+      <w:pPr>
+        <w:tabs>
+          <w:tab w:val="num" w:pos="5760"/>
+        </w:tabs>
+        <w:ind w:left="5760" w:hanging="360"/>
+      </w:pPr>
+      <w:rPr>
+        <w:rFonts w:ascii="Wingdings" w:hAnsi="Wingdings" w:hint="default"/>
+        <w:sz w:val="20"/>
+      </w:rPr>
+    </w:lvl>
+    <w:lvl w:ilvl="8" w:tentative="1">
+      <w:start w:val="1"/>
+      <w:numFmt w:val="bullet"/>
+      <w:lvlText w:val=""/>
+      <w:lvlJc w:val="left"/>
+      <w:pPr>
+        <w:tabs>
+          <w:tab w:val="num" w:pos="6480"/>
+        </w:tabs>
+        <w:ind w:left="6480" w:hanging="360"/>
+      </w:pPr>
+      <w:rPr>
+        <w:rFonts w:ascii="Wingdings" w:hAnsi="Wingdings" w:hint="default"/>
+        <w:sz w:val="20"/>
+      </w:rPr>
+    </w:lvl>
+  </w:abstractNum>
+  <w:abstractNum w:abstractNumId="4" w15:restartNumberingAfterBreak="0">
     <w:nsid w:val="74A24675"/>
     <w:multiLevelType w:val="multilevel"/>
     <w:tmpl w:val="5218B630"/>
@@ -8285,13 +11052,19 @@
     </w:lvl>
   </w:abstractNum>
   <w:num w:numId="1" w16cid:durableId="556084686">
-    <w:abstractNumId w:val="0"/>
+    <w:abstractNumId w:val="2"/>
   </w:num>
   <w:num w:numId="2" w16cid:durableId="2132705251">
-    <w:abstractNumId w:val="2"/>
+    <w:abstractNumId w:val="4"/>
   </w:num>
   <w:num w:numId="3" w16cid:durableId="2101295758">
+    <w:abstractNumId w:val="3"/>
+  </w:num>
+  <w:num w:numId="4" w16cid:durableId="2076200649">
     <w:abstractNumId w:val="1"/>
+  </w:num>
+  <w:num w:numId="5" w16cid:durableId="831066800">
+    <w:abstractNumId w:val="0"/>
   </w:num>
 </w:numbering>
 </file>

</xml_diff>